<commit_message>
docs: refine IEEE article layout and narrative
</commit_message>
<xml_diff>
--- a/docs/artikel-ieee/Artikel IEEE - 24.55.2714 - Muhammad Rizky Hajar.docx
+++ b/docs/artikel-ieee/Artikel IEEE - 24.55.2714 - Muhammad Rizky Hajar.docx
@@ -234,23 +234,158 @@
           </w:p>
         </w:tc>
       </w:tr>
+      <w:tr>
+        <w:tc>
+          <w:tcPr>
+            <w:tcW w:type="dxa" w:w="3420"/>
+            <w:tcMar>
+              <w:top w:w="60" w:type="dxa"/>
+              <w:start w:w="80" w:type="dxa"/>
+              <w:bottom w:w="60" w:type="dxa"/>
+              <w:end w:w="80" w:type="dxa"/>
+            </w:tcMar>
+            <w:tcBorders/>
+          </w:tcPr>
+          <w:p>
+            <w:pPr>
+              <w:spacing w:after="0"/>
+              <w:jc w:val="center"/>
+            </w:pPr>
+            <w:r>
+              <w:rPr>
+                <w:rFonts w:ascii="Times New Roman" w:hAnsi="Times New Roman"/>
+                <w:i w:val="0"/>
+                <w:color w:val="000000"/>
+                <w:sz w:val="20"/>
+              </w:rPr>
+              <w:t>Andi Sunyoto</w:t>
+            </w:r>
+            <w:r>
+              <w:rPr>
+                <w:rFonts w:ascii="Times New Roman" w:hAnsi="Times New Roman"/>
+                <w:i w:val="0"/>
+                <w:color w:val="000000"/>
+                <w:sz w:val="18"/>
+              </w:rPr>
+              <w:br/>
+              <w:t>Department of Computer Science</w:t>
+            </w:r>
+            <w:r>
+              <w:rPr>
+                <w:rFonts w:ascii="Times New Roman" w:hAnsi="Times New Roman"/>
+                <w:i w:val="0"/>
+                <w:color w:val="000000"/>
+                <w:sz w:val="18"/>
+              </w:rPr>
+              <w:br/>
+              <w:t>Universitas Amikom Yogyakarta</w:t>
+            </w:r>
+            <w:r>
+              <w:rPr>
+                <w:rFonts w:ascii="Times New Roman" w:hAnsi="Times New Roman"/>
+                <w:i w:val="0"/>
+                <w:color w:val="000000"/>
+                <w:sz w:val="18"/>
+              </w:rPr>
+              <w:br/>
+              <w:t>Yogyakarta, Indonesia</w:t>
+            </w:r>
+            <w:r>
+              <w:rPr>
+                <w:rFonts w:ascii="Times New Roman" w:hAnsi="Times New Roman"/>
+                <w:i/>
+                <w:color w:val="000000"/>
+                <w:sz w:val="17"/>
+              </w:rPr>
+              <w:br/>
+              <w:t>andi@amikom.ac.id</w:t>
+            </w:r>
+          </w:p>
+        </w:tc>
+        <w:tc>
+          <w:tcPr>
+            <w:tcW w:type="dxa" w:w="3420"/>
+            <w:tcMar>
+              <w:top w:w="60" w:type="dxa"/>
+              <w:start w:w="80" w:type="dxa"/>
+              <w:bottom w:w="60" w:type="dxa"/>
+              <w:end w:w="80" w:type="dxa"/>
+            </w:tcMar>
+            <w:tcBorders/>
+          </w:tcPr>
+          <w:p>
+            <w:pPr>
+              <w:spacing w:after="0"/>
+              <w:jc w:val="center"/>
+            </w:pPr>
+            <w:r>
+              <w:rPr>
+                <w:rFonts w:ascii="Times New Roman" w:hAnsi="Times New Roman"/>
+                <w:i w:val="0"/>
+                <w:color w:val="000000"/>
+                <w:sz w:val="20"/>
+              </w:rPr>
+              <w:t>Robert Marco</w:t>
+            </w:r>
+            <w:r>
+              <w:rPr>
+                <w:rFonts w:ascii="Times New Roman" w:hAnsi="Times New Roman"/>
+                <w:i w:val="0"/>
+                <w:color w:val="000000"/>
+                <w:sz w:val="18"/>
+              </w:rPr>
+              <w:br/>
+              <w:t>Department of Computer Science</w:t>
+            </w:r>
+            <w:r>
+              <w:rPr>
+                <w:rFonts w:ascii="Times New Roman" w:hAnsi="Times New Roman"/>
+                <w:i w:val="0"/>
+                <w:color w:val="000000"/>
+                <w:sz w:val="18"/>
+              </w:rPr>
+              <w:br/>
+              <w:t>Universitas Amikom Yogyakarta</w:t>
+            </w:r>
+            <w:r>
+              <w:rPr>
+                <w:rFonts w:ascii="Times New Roman" w:hAnsi="Times New Roman"/>
+                <w:i w:val="0"/>
+                <w:color w:val="000000"/>
+                <w:sz w:val="18"/>
+              </w:rPr>
+              <w:br/>
+              <w:t>Yogyakarta, Indonesia</w:t>
+            </w:r>
+            <w:r>
+              <w:rPr>
+                <w:rFonts w:ascii="Times New Roman" w:hAnsi="Times New Roman"/>
+                <w:i/>
+                <w:color w:val="000000"/>
+                <w:sz w:val="17"/>
+              </w:rPr>
+              <w:br/>
+              <w:t>robert.marco@amikom.ac.id</w:t>
+            </w:r>
+          </w:p>
+        </w:tc>
+        <w:tc>
+          <w:tcPr>
+            <w:tcW w:type="dxa" w:w="3420"/>
+            <w:tcMar>
+              <w:top w:w="60" w:type="dxa"/>
+              <w:start w:w="80" w:type="dxa"/>
+              <w:bottom w:w="60" w:type="dxa"/>
+              <w:end w:w="80" w:type="dxa"/>
+            </w:tcMar>
+            <w:tcBorders/>
+          </w:tcPr>
+          <w:p>
+            <w:r/>
+          </w:p>
+        </w:tc>
+      </w:tr>
     </w:tbl>
-    <w:p>
-      <w:pPr>
-        <w:spacing w:before="80" w:after="140"/>
-        <w:jc w:val="center"/>
-      </w:pPr>
-      <w:r>
-        <w:rPr>
-          <w:rFonts w:ascii="Times New Roman" w:hAnsi="Times New Roman"/>
-          <w:b w:val="0"/>
-          <w:i w:val="0"/>
-          <w:color w:val="000000"/>
-          <w:sz w:val="17"/>
-        </w:rPr>
-        <w:t>Supervisi: Dr. Andi Sunyoto, M.Kom | Dosen kelas: Robert Marco, M.T., Ph.D</w:t>
-      </w:r>
-    </w:p>
     <w:p>
       <w:pPr>
         <w:sectPr>
@@ -2878,7 +3013,7 @@
           <w:color w:val="000000"/>
           <w:sz w:val="20"/>
         </w:rPr>
-        <w:t xml:space="preserve">Fig. 1 memperlihatkan bahwa distribusi target relatif berimbang. Missing value terkonsentrasi pada </w:t>
+        <w:t xml:space="preserve">Komposisi target pada dataset pemodelan relatif berimbang, sehingga evaluasi model tidak berangkat dari dominasi satu kelas yang ekstrem. Keseimbangan ini menjadi titik awal yang penting karena tujuan penelitian bukan hanya memperoleh accuracy tinggi, tetapi juga menjaga kemampuan model mengenali mahasiswa yang masuk kelompok </w:t>
       </w:r>
       <w:r>
         <w:rPr>
@@ -2888,7 +3023,7 @@
           <w:color w:val="000000"/>
           <w:sz w:val="20"/>
         </w:rPr>
-        <w:t>imd_band</w:t>
+        <w:t>AtRisk</w:t>
       </w:r>
       <w:r>
         <w:rPr>
@@ -2898,39 +3033,8 @@
           <w:color w:val="000000"/>
           <w:sz w:val="20"/>
         </w:rPr>
-        <w:t xml:space="preserve"> dan sebagian kecil pada </w:t>
-      </w:r>
-      <w:r>
-        <w:rPr>
-          <w:rFonts w:ascii="Times New Roman" w:hAnsi="Times New Roman"/>
-          <w:b w:val="0"/>
-          <w:i/>
-          <w:color w:val="000000"/>
-          <w:sz w:val="20"/>
-        </w:rPr>
-        <w:t>date_registration</w:t>
-      </w:r>
-      <w:r>
-        <w:rPr>
-          <w:rFonts w:ascii="Times New Roman" w:hAnsi="Times New Roman"/>
-          <w:b w:val="0"/>
-          <w:i w:val="0"/>
-          <w:color w:val="000000"/>
-          <w:sz w:val="20"/>
-        </w:rPr>
-        <w:t>; keduanya ditangani di dalam pipeline berdasarkan data train-validation.</w:t>
-      </w:r>
-    </w:p>
-    <w:p>
-      <w:pPr>
-        <w:sectPr>
-          <w:type w:val="continuous"/>
-          <w:pgSz w:w="12240" w:h="15840"/>
-          <w:pgMar w:top="936" w:right="936" w:bottom="936" w:left="936" w:header="432" w:footer="432" w:gutter="0"/>
-          <w:cols w:space="360" w:num="2" w:equalWidth="1"/>
-          <w:docGrid w:linePitch="360"/>
-        </w:sectPr>
-      </w:pPr>
+        <w:t>.</w:t>
+      </w:r>
     </w:p>
     <w:p>
       <w:pPr>
@@ -2941,8 +3045,8 @@
       <w:r>
         <w:drawing>
           <wp:inline xmlns:a="http://schemas.openxmlformats.org/drawingml/2006/main" xmlns:pic="http://schemas.openxmlformats.org/drawingml/2006/picture">
-            <wp:extent cx="6446520" cy="1788630"/>
-            <wp:docPr id="1" name="Picture 1" descr="Fig. 1. Distribusi target dan missing value pada dataset pemodelan." title="Fig"/>
+            <wp:extent cx="2971800" cy="1649091"/>
+            <wp:docPr id="1" name="Picture 1" descr="Fig. 1. Distribusi target pada dataset pemodelan." title="Fig"/>
             <wp:cNvGraphicFramePr>
               <a:graphicFrameLocks noChangeAspect="1"/>
             </wp:cNvGraphicFramePr>
@@ -2950,7 +3054,7 @@
               <a:graphicData uri="http://schemas.openxmlformats.org/drawingml/2006/picture">
                 <pic:pic>
                   <pic:nvPicPr>
-                    <pic:cNvPr id="0" name="fig-1-eda.png"/>
+                    <pic:cNvPr id="0" name="fig-1a-target-distribution.png"/>
                     <pic:cNvPicPr/>
                   </pic:nvPicPr>
                   <pic:blipFill>
@@ -2962,7 +3066,7 @@
                   <pic:spPr>
                     <a:xfrm>
                       <a:off x="0" y="0"/>
-                      <a:ext cx="6446520" cy="1788630"/>
+                      <a:ext cx="2971800" cy="1649091"/>
                     </a:xfrm>
                     <a:prstGeom prst="rect"/>
                   </pic:spPr>
@@ -2987,19 +3091,123 @@
           <w:color w:val="000000"/>
           <w:sz w:val="16"/>
         </w:rPr>
-        <w:t>Fig. 1. Distribusi target dan missing value pada dataset pemodelan.</w:t>
+        <w:t>Fig. 1. Distribusi target pada dataset pemodelan.</w:t>
       </w:r>
     </w:p>
     <w:p>
       <w:pPr>
-        <w:sectPr>
-          <w:type w:val="continuous"/>
-          <w:pgSz w:w="12240" w:h="15840"/>
-          <w:pgMar w:top="936" w:right="936" w:bottom="936" w:left="936" w:header="432" w:footer="432" w:gutter="0"/>
-          <w:cols w:space="360" w:num="1" w:equalWidth="1"/>
-          <w:docGrid w:linePitch="360"/>
-        </w:sectPr>
+        <w:spacing w:before="0" w:after="60" w:line="240" w:lineRule="auto"/>
+        <w:ind w:firstLine="259"/>
+        <w:jc w:val="both"/>
       </w:pPr>
+      <w:r>
+        <w:rPr>
+          <w:rFonts w:ascii="Times New Roman" w:hAnsi="Times New Roman"/>
+          <w:b w:val="0"/>
+          <w:i w:val="0"/>
+          <w:color w:val="000000"/>
+          <w:sz w:val="20"/>
+        </w:rPr>
+        <w:t xml:space="preserve">Pemeriksaan kualitas data kemudian dilakukan sebelum model dilatih. Missing value terutama muncul pada </w:t>
+      </w:r>
+      <w:r>
+        <w:rPr>
+          <w:rFonts w:ascii="Times New Roman" w:hAnsi="Times New Roman"/>
+          <w:b w:val="0"/>
+          <w:i/>
+          <w:color w:val="000000"/>
+          <w:sz w:val="20"/>
+        </w:rPr>
+        <w:t>imd_band</w:t>
+      </w:r>
+      <w:r>
+        <w:rPr>
+          <w:rFonts w:ascii="Times New Roman" w:hAnsi="Times New Roman"/>
+          <w:b w:val="0"/>
+          <w:i w:val="0"/>
+          <w:color w:val="000000"/>
+          <w:sz w:val="20"/>
+        </w:rPr>
+        <w:t xml:space="preserve">, dengan jumlah yang jauh lebih kecil pada </w:t>
+      </w:r>
+      <w:r>
+        <w:rPr>
+          <w:rFonts w:ascii="Times New Roman" w:hAnsi="Times New Roman"/>
+          <w:b w:val="0"/>
+          <w:i/>
+          <w:color w:val="000000"/>
+          <w:sz w:val="20"/>
+        </w:rPr>
+        <w:t>date_registration</w:t>
+      </w:r>
+      <w:r>
+        <w:rPr>
+          <w:rFonts w:ascii="Times New Roman" w:hAnsi="Times New Roman"/>
+          <w:b w:val="0"/>
+          <w:i w:val="0"/>
+          <w:color w:val="000000"/>
+          <w:sz w:val="20"/>
+        </w:rPr>
+        <w:t>. Dua kondisi tersebut ditangani di dalam pipeline berdasarkan data train-validation agar proses imputasi tidak membawa informasi dari hold-out test.</w:t>
+      </w:r>
+    </w:p>
+    <w:p>
+      <w:pPr>
+        <w:keepNext/>
+        <w:spacing w:before="80" w:after="20"/>
+        <w:jc w:val="center"/>
+      </w:pPr>
+      <w:r>
+        <w:drawing>
+          <wp:inline xmlns:a="http://schemas.openxmlformats.org/drawingml/2006/main" xmlns:pic="http://schemas.openxmlformats.org/drawingml/2006/picture">
+            <wp:extent cx="2971800" cy="1649091"/>
+            <wp:docPr id="2" name="Picture 2" descr="Fig. 2. Missing value pada fitur dataset pemodelan." title="Fig"/>
+            <wp:cNvGraphicFramePr>
+              <a:graphicFrameLocks noChangeAspect="1"/>
+            </wp:cNvGraphicFramePr>
+            <a:graphic>
+              <a:graphicData uri="http://schemas.openxmlformats.org/drawingml/2006/picture">
+                <pic:pic>
+                  <pic:nvPicPr>
+                    <pic:cNvPr id="0" name="fig-1b-missing-values.png"/>
+                    <pic:cNvPicPr/>
+                  </pic:nvPicPr>
+                  <pic:blipFill>
+                    <a:blip r:embed="rId10"/>
+                    <a:stretch>
+                      <a:fillRect/>
+                    </a:stretch>
+                  </pic:blipFill>
+                  <pic:spPr>
+                    <a:xfrm>
+                      <a:off x="0" y="0"/>
+                      <a:ext cx="2971800" cy="1649091"/>
+                    </a:xfrm>
+                    <a:prstGeom prst="rect"/>
+                  </pic:spPr>
+                </pic:pic>
+              </a:graphicData>
+            </a:graphic>
+          </wp:inline>
+        </w:drawing>
+      </w:r>
+    </w:p>
+    <w:p>
+      <w:pPr>
+        <w:keepLines/>
+        <w:spacing w:before="20" w:after="80"/>
+        <w:jc w:val="center"/>
+      </w:pPr>
+      <w:r>
+        <w:rPr>
+          <w:rFonts w:ascii="Times New Roman" w:hAnsi="Times New Roman"/>
+          <w:b w:val="0"/>
+          <w:i w:val="0"/>
+          <w:color w:val="000000"/>
+          <w:sz w:val="16"/>
+        </w:rPr>
+        <w:t>Fig. 2. Missing value pada fitur dataset pemodelan.</w:t>
+      </w:r>
     </w:p>
     <w:p>
       <w:pPr>
@@ -3811,6 +4019,11 @@
     </w:tbl>
     <w:p>
       <w:pPr>
+        <w:spacing w:before="0" w:after="140" w:line="240" w:lineRule="auto"/>
+      </w:pPr>
+    </w:p>
+    <w:p>
+      <w:pPr>
         <w:pStyle w:val="Heading2"/>
         <w:keepNext/>
         <w:spacing w:before="100" w:after="40"/>
@@ -4639,60 +4852,8 @@
     </w:tbl>
     <w:p>
       <w:pPr>
-        <w:spacing w:before="0" w:after="60" w:line="240" w:lineRule="auto"/>
-        <w:ind w:firstLine="259"/>
-        <w:jc w:val="both"/>
+        <w:spacing w:before="0" w:after="140" w:line="240" w:lineRule="auto"/>
       </w:pPr>
-      <w:r>
-        <w:rPr>
-          <w:rFonts w:ascii="Times New Roman" w:hAnsi="Times New Roman"/>
-          <w:b w:val="0"/>
-          <w:i w:val="0"/>
-          <w:color w:val="000000"/>
-          <w:sz w:val="20"/>
-        </w:rPr>
-        <w:t xml:space="preserve">Classification report Random Forest menunjukkan precision 0,80, recall 0,72, dan F1-score 0,76 pada 3.398 kasus </w:t>
-      </w:r>
-      <w:r>
-        <w:rPr>
-          <w:rFonts w:ascii="Times New Roman" w:hAnsi="Times New Roman"/>
-          <w:b w:val="0"/>
-          <w:i/>
-          <w:color w:val="000000"/>
-          <w:sz w:val="20"/>
-        </w:rPr>
-        <w:t>AtRisk</w:t>
-      </w:r>
-      <w:r>
-        <w:rPr>
-          <w:rFonts w:ascii="Times New Roman" w:hAnsi="Times New Roman"/>
-          <w:b w:val="0"/>
-          <w:i w:val="0"/>
-          <w:color w:val="000000"/>
-          <w:sz w:val="20"/>
-        </w:rPr>
-        <w:t xml:space="preserve">. Pada 3.073 kasus </w:t>
-      </w:r>
-      <w:r>
-        <w:rPr>
-          <w:rFonts w:ascii="Times New Roman" w:hAnsi="Times New Roman"/>
-          <w:b w:val="0"/>
-          <w:i/>
-          <w:color w:val="000000"/>
-          <w:sz w:val="20"/>
-        </w:rPr>
-        <w:t>Successful</w:t>
-      </w:r>
-      <w:r>
-        <w:rPr>
-          <w:rFonts w:ascii="Times New Roman" w:hAnsi="Times New Roman"/>
-          <w:b w:val="0"/>
-          <w:i w:val="0"/>
-          <w:color w:val="000000"/>
-          <w:sz w:val="20"/>
-        </w:rPr>
-        <w:t>, precision mencapai 0,72, recall 0,81, dan F1-score 0,76. Weighted average F1-score mencapai 0,76.</w:t>
-      </w:r>
     </w:p>
     <w:p>
       <w:pPr>
@@ -4708,7 +4869,7 @@
           <w:color w:val="000000"/>
           <w:sz w:val="20"/>
         </w:rPr>
-        <w:t xml:space="preserve">Fig. 2 merangkum perbandingan metrik, confusion matrix Random Forest, dan kurva ROC. Confusion matrix menunjukkan 2.437 kasus </w:t>
+        <w:t xml:space="preserve">Classification report Random Forest menunjukkan precision 0,80, recall 0,72, dan F1-score 0,76 pada 3.398 kasus </w:t>
       </w:r>
       <w:r>
         <w:rPr>
@@ -4728,7 +4889,7 @@
           <w:color w:val="000000"/>
           <w:sz w:val="20"/>
         </w:rPr>
-        <w:t xml:space="preserve"> terdeteksi dan 961 kasus </w:t>
+        <w:t xml:space="preserve">. Pada 3.073 kasus </w:t>
       </w:r>
       <w:r>
         <w:rPr>
@@ -4738,6 +4899,26 @@
           <w:color w:val="000000"/>
           <w:sz w:val="20"/>
         </w:rPr>
+        <w:t>Successful</w:t>
+      </w:r>
+      <w:r>
+        <w:rPr>
+          <w:rFonts w:ascii="Times New Roman" w:hAnsi="Times New Roman"/>
+          <w:b w:val="0"/>
+          <w:i w:val="0"/>
+          <w:color w:val="000000"/>
+          <w:sz w:val="20"/>
+        </w:rPr>
+        <w:t xml:space="preserve">, precision mencapai 0,72, recall 0,81, dan F1-score 0,76. Weighted average F1-score mencapai 0,76. Perbandingan metrik antar model menempatkan Random Forest sebagai pilihan yang paling relevan untuk konteks early warning karena recall </w:t>
+      </w:r>
+      <w:r>
+        <w:rPr>
+          <w:rFonts w:ascii="Times New Roman" w:hAnsi="Times New Roman"/>
+          <w:b w:val="0"/>
+          <w:i/>
+          <w:color w:val="000000"/>
+          <w:sz w:val="20"/>
+        </w:rPr>
         <w:t>AtRisk</w:t>
       </w:r>
       <w:r>
@@ -4748,19 +4929,8 @@
           <w:color w:val="000000"/>
           <w:sz w:val="20"/>
         </w:rPr>
-        <w:t xml:space="preserve"> belum terdeteksi pada hold-out test. Kedekatan kurva ROC ketiga model konsisten dengan selisih ROC-AUC yang relatif kecil.</w:t>
-      </w:r>
-    </w:p>
-    <w:p>
-      <w:pPr>
-        <w:sectPr>
-          <w:type w:val="continuous"/>
-          <w:pgSz w:w="12240" w:h="15840"/>
-          <w:pgMar w:top="936" w:right="936" w:bottom="936" w:left="936" w:header="432" w:footer="432" w:gutter="0"/>
-          <w:cols w:space="360" w:num="2" w:equalWidth="1"/>
-          <w:docGrid w:linePitch="360"/>
-        </w:sectPr>
-      </w:pPr>
+        <w:t xml:space="preserve"> menjadi ukuran yang paling dekat dengan kebutuhan menemukan mahasiswa berisiko sejak awal.</w:t>
+      </w:r>
     </w:p>
     <w:p>
       <w:pPr>
@@ -4771,8 +4941,8 @@
       <w:r>
         <w:drawing>
           <wp:inline xmlns:a="http://schemas.openxmlformats.org/drawingml/2006/main" xmlns:pic="http://schemas.openxmlformats.org/drawingml/2006/picture">
-            <wp:extent cx="6446520" cy="1572639"/>
-            <wp:docPr id="2" name="Picture 2" descr="Fig. 2. Perbandingan metrik, confusion matrix Random Forest, dan kurva ROC pada hold-out test." title="Fig"/>
+            <wp:extent cx="2971800" cy="2176023"/>
+            <wp:docPr id="3" name="Picture 3" descr="Fig. 3. Perbandingan metrik AtRisk pada hold-out test." title="Fig"/>
             <wp:cNvGraphicFramePr>
               <a:graphicFrameLocks noChangeAspect="1"/>
             </wp:cNvGraphicFramePr>
@@ -4780,11 +4950,11 @@
               <a:graphicData uri="http://schemas.openxmlformats.org/drawingml/2006/picture">
                 <pic:pic>
                   <pic:nvPicPr>
-                    <pic:cNvPr id="0" name="fig-2-model-evaluation.png"/>
+                    <pic:cNvPr id="0" name="fig-2a-metrics-comparison.png"/>
                     <pic:cNvPicPr/>
                   </pic:nvPicPr>
                   <pic:blipFill>
-                    <a:blip r:embed="rId10"/>
+                    <a:blip r:embed="rId11"/>
                     <a:stretch>
                       <a:fillRect/>
                     </a:stretch>
@@ -4792,7 +4962,7 @@
                   <pic:spPr>
                     <a:xfrm>
                       <a:off x="0" y="0"/>
-                      <a:ext cx="6446520" cy="1572639"/>
+                      <a:ext cx="2971800" cy="2176023"/>
                     </a:xfrm>
                     <a:prstGeom prst="rect"/>
                   </pic:spPr>
@@ -4817,19 +4987,8 @@
           <w:color w:val="000000"/>
           <w:sz w:val="16"/>
         </w:rPr>
-        <w:t>Fig. 2. Perbandingan metrik, confusion matrix Random Forest, dan kurva ROC pada hold-out test.</w:t>
-      </w:r>
-    </w:p>
-    <w:p>
-      <w:pPr>
-        <w:sectPr>
-          <w:type w:val="continuous"/>
-          <w:pgSz w:w="12240" w:h="15840"/>
-          <w:pgMar w:top="936" w:right="936" w:bottom="936" w:left="936" w:header="432" w:footer="432" w:gutter="0"/>
-          <w:cols w:space="360" w:num="1" w:equalWidth="1"/>
-          <w:docGrid w:linePitch="360"/>
-        </w:sectPr>
-      </w:pPr>
+        <w:t>Fig. 3. Perbandingan metrik AtRisk pada hold-out test.</w:t>
+      </w:r>
     </w:p>
     <w:p>
       <w:pPr>
@@ -4845,19 +5004,28 @@
           <w:color w:val="000000"/>
           <w:sz w:val="20"/>
         </w:rPr>
-        <w:t>Feature importance pada Fig. 3 menunjukkan bahwa total klik VLE, hari aktivitas terakhir, jumlah hari aktif VLE, dan jumlah situs VLE menjadi prediktor teratas. Fitur assessment dan registrasi juga berkontribusi. Nilai importance menunjukkan kontribusi prediktif dalam Random Forest dan tidak menyatakan hubungan sebab akibat.</w:t>
-      </w:r>
-    </w:p>
-    <w:p>
-      <w:pPr>
-        <w:sectPr>
-          <w:type w:val="continuous"/>
-          <w:pgSz w:w="12240" w:h="15840"/>
-          <w:pgMar w:top="936" w:right="936" w:bottom="936" w:left="936" w:header="432" w:footer="432" w:gutter="0"/>
-          <w:cols w:space="360" w:num="2" w:equalWidth="1"/>
-          <w:docGrid w:linePitch="360"/>
-        </w:sectPr>
-      </w:pPr>
+        <w:t xml:space="preserve">Setelah model dipilih, pola kesalahan Random Forest diperiksa untuk memahami risiko operasionalnya. Model tersebut berhasil mengenali 2.437 kasus </w:t>
+      </w:r>
+      <w:r>
+        <w:rPr>
+          <w:rFonts w:ascii="Times New Roman" w:hAnsi="Times New Roman"/>
+          <w:b w:val="0"/>
+          <w:i/>
+          <w:color w:val="000000"/>
+          <w:sz w:val="20"/>
+        </w:rPr>
+        <w:t>AtRisk</w:t>
+      </w:r>
+      <w:r>
+        <w:rPr>
+          <w:rFonts w:ascii="Times New Roman" w:hAnsi="Times New Roman"/>
+          <w:b w:val="0"/>
+          <w:i w:val="0"/>
+          <w:color w:val="000000"/>
+          <w:sz w:val="20"/>
+        </w:rPr>
+        <w:t>, tetapi masih melewatkan 961 kasus yang seharusnya masuk kelompok berisiko. Temuan ini menunjukkan bahwa sistem sudah cukup kuat untuk menyaring sebagian besar mahasiswa berisiko, namun tetap membutuhkan lapisan prioritas dan verifikasi agar kasus yang belum terdeteksi dapat diminimalkan.</w:t>
+      </w:r>
     </w:p>
     <w:p>
       <w:pPr>
@@ -4868,8 +5036,158 @@
       <w:r>
         <w:drawing>
           <wp:inline xmlns:a="http://schemas.openxmlformats.org/drawingml/2006/main" xmlns:pic="http://schemas.openxmlformats.org/drawingml/2006/picture">
-            <wp:extent cx="4754880" cy="2816278"/>
-            <wp:docPr id="3" name="Picture 3" descr="Fig. 3. Lima belas fitur dengan feature importance tertinggi pada Random Forest." title="Fig"/>
+            <wp:extent cx="2971800" cy="2176023"/>
+            <wp:docPr id="4" name="Picture 4" descr="Fig. 4. Confusion matrix Random Forest pada hold-out test." title="Fig"/>
+            <wp:cNvGraphicFramePr>
+              <a:graphicFrameLocks noChangeAspect="1"/>
+            </wp:cNvGraphicFramePr>
+            <a:graphic>
+              <a:graphicData uri="http://schemas.openxmlformats.org/drawingml/2006/picture">
+                <pic:pic>
+                  <pic:nvPicPr>
+                    <pic:cNvPr id="0" name="fig-2b-confusion-matrix.png"/>
+                    <pic:cNvPicPr/>
+                  </pic:nvPicPr>
+                  <pic:blipFill>
+                    <a:blip r:embed="rId12"/>
+                    <a:stretch>
+                      <a:fillRect/>
+                    </a:stretch>
+                  </pic:blipFill>
+                  <pic:spPr>
+                    <a:xfrm>
+                      <a:off x="0" y="0"/>
+                      <a:ext cx="2971800" cy="2176023"/>
+                    </a:xfrm>
+                    <a:prstGeom prst="rect"/>
+                  </pic:spPr>
+                </pic:pic>
+              </a:graphicData>
+            </a:graphic>
+          </wp:inline>
+        </w:drawing>
+      </w:r>
+    </w:p>
+    <w:p>
+      <w:pPr>
+        <w:keepLines/>
+        <w:spacing w:before="20" w:after="80"/>
+        <w:jc w:val="center"/>
+      </w:pPr>
+      <w:r>
+        <w:rPr>
+          <w:rFonts w:ascii="Times New Roman" w:hAnsi="Times New Roman"/>
+          <w:b w:val="0"/>
+          <w:i w:val="0"/>
+          <w:color w:val="000000"/>
+          <w:sz w:val="16"/>
+        </w:rPr>
+        <w:t>Fig. 4. Confusion matrix Random Forest pada hold-out test.</w:t>
+      </w:r>
+    </w:p>
+    <w:p>
+      <w:pPr>
+        <w:spacing w:before="0" w:after="60" w:line="240" w:lineRule="auto"/>
+        <w:ind w:firstLine="259"/>
+        <w:jc w:val="both"/>
+      </w:pPr>
+      <w:r>
+        <w:rPr>
+          <w:rFonts w:ascii="Times New Roman" w:hAnsi="Times New Roman"/>
+          <w:b w:val="0"/>
+          <w:i w:val="0"/>
+          <w:color w:val="000000"/>
+          <w:sz w:val="20"/>
+        </w:rPr>
+        <w:t>Kurva ROC memberikan konteks tambahan terhadap perbedaan antar model. Ketiga kurva berada cukup berdekatan, sehingga selisih ROC-AUC perlu dibaca bersama tujuan keputusan. Dalam penelitian ini, kemampuan memperluas cakupan deteksi lebih diprioritaskan daripada memilih model hanya berdasarkan peringkat ROC-AUC.</w:t>
+      </w:r>
+    </w:p>
+    <w:p>
+      <w:pPr>
+        <w:keepNext/>
+        <w:spacing w:before="80" w:after="20"/>
+        <w:jc w:val="center"/>
+      </w:pPr>
+      <w:r>
+        <w:drawing>
+          <wp:inline xmlns:a="http://schemas.openxmlformats.org/drawingml/2006/main" xmlns:pic="http://schemas.openxmlformats.org/drawingml/2006/picture">
+            <wp:extent cx="2971800" cy="2172736"/>
+            <wp:docPr id="5" name="Picture 5" descr="Fig. 5. Kurva ROC pada hold-out test." title="Fig"/>
+            <wp:cNvGraphicFramePr>
+              <a:graphicFrameLocks noChangeAspect="1"/>
+            </wp:cNvGraphicFramePr>
+            <a:graphic>
+              <a:graphicData uri="http://schemas.openxmlformats.org/drawingml/2006/picture">
+                <pic:pic>
+                  <pic:nvPicPr>
+                    <pic:cNvPr id="0" name="fig-2c-roc-curve.png"/>
+                    <pic:cNvPicPr/>
+                  </pic:nvPicPr>
+                  <pic:blipFill>
+                    <a:blip r:embed="rId13"/>
+                    <a:stretch>
+                      <a:fillRect/>
+                    </a:stretch>
+                  </pic:blipFill>
+                  <pic:spPr>
+                    <a:xfrm>
+                      <a:off x="0" y="0"/>
+                      <a:ext cx="2971800" cy="2172736"/>
+                    </a:xfrm>
+                    <a:prstGeom prst="rect"/>
+                  </pic:spPr>
+                </pic:pic>
+              </a:graphicData>
+            </a:graphic>
+          </wp:inline>
+        </w:drawing>
+      </w:r>
+    </w:p>
+    <w:p>
+      <w:pPr>
+        <w:keepLines/>
+        <w:spacing w:before="20" w:after="80"/>
+        <w:jc w:val="center"/>
+      </w:pPr>
+      <w:r>
+        <w:rPr>
+          <w:rFonts w:ascii="Times New Roman" w:hAnsi="Times New Roman"/>
+          <w:b w:val="0"/>
+          <w:i w:val="0"/>
+          <w:color w:val="000000"/>
+          <w:sz w:val="16"/>
+        </w:rPr>
+        <w:t>Fig. 5. Kurva ROC pada hold-out test.</w:t>
+      </w:r>
+    </w:p>
+    <w:p>
+      <w:pPr>
+        <w:spacing w:before="0" w:after="60" w:line="240" w:lineRule="auto"/>
+        <w:ind w:firstLine="259"/>
+        <w:jc w:val="both"/>
+      </w:pPr>
+      <w:r>
+        <w:rPr>
+          <w:rFonts w:ascii="Times New Roman" w:hAnsi="Times New Roman"/>
+          <w:b w:val="0"/>
+          <w:i w:val="0"/>
+          <w:color w:val="000000"/>
+          <w:sz w:val="20"/>
+        </w:rPr>
+        <w:t>Kontribusi fitur Random Forest memperlihatkan bahwa sinyal perilaku awal menjadi pembeda utama. Total klik VLE, hari aktivitas terakhir, jumlah hari aktif, dan ragam situs yang diakses muncul sebagai prediktor teratas, diikuti fitur assessment dan registrasi. Temuan ini selaras dengan tujuan early warning karena model banyak bertumpu pada jejak engagement yang sudah tersedia sampai akhir minggu keempat. Nilai importance tetap dibaca sebagai kontribusi prediktif, bukan bukti hubungan sebab akibat.</w:t>
+      </w:r>
+    </w:p>
+    <w:p>
+      <w:pPr>
+        <w:keepNext/>
+        <w:spacing w:before="80" w:after="20"/>
+        <w:jc w:val="center"/>
+      </w:pPr>
+      <w:r>
+        <w:drawing>
+          <wp:inline xmlns:a="http://schemas.openxmlformats.org/drawingml/2006/main" xmlns:pic="http://schemas.openxmlformats.org/drawingml/2006/picture">
+            <wp:extent cx="2971800" cy="1760174"/>
+            <wp:docPr id="6" name="Picture 6" descr="Fig. 6. Lima belas fitur dengan feature importance tertinggi pada Random Forest." title="Fig"/>
             <wp:cNvGraphicFramePr>
               <a:graphicFrameLocks noChangeAspect="1"/>
             </wp:cNvGraphicFramePr>
@@ -4881,7 +5199,7 @@
                     <pic:cNvPicPr/>
                   </pic:nvPicPr>
                   <pic:blipFill>
-                    <a:blip r:embed="rId11"/>
+                    <a:blip r:embed="rId14"/>
                     <a:stretch>
                       <a:fillRect/>
                     </a:stretch>
@@ -4889,7 +5207,7 @@
                   <pic:spPr>
                     <a:xfrm>
                       <a:off x="0" y="0"/>
-                      <a:ext cx="4754880" cy="2816278"/>
+                      <a:ext cx="2971800" cy="1760174"/>
                     </a:xfrm>
                     <a:prstGeom prst="rect"/>
                   </pic:spPr>
@@ -4914,19 +5232,8 @@
           <w:color w:val="000000"/>
           <w:sz w:val="16"/>
         </w:rPr>
-        <w:t>Fig. 3. Lima belas fitur dengan feature importance tertinggi pada Random Forest.</w:t>
-      </w:r>
-    </w:p>
-    <w:p>
-      <w:pPr>
-        <w:sectPr>
-          <w:type w:val="continuous"/>
-          <w:pgSz w:w="12240" w:h="15840"/>
-          <w:pgMar w:top="936" w:right="936" w:bottom="936" w:left="936" w:header="432" w:footer="432" w:gutter="0"/>
-          <w:cols w:space="360" w:num="1" w:equalWidth="1"/>
-          <w:docGrid w:linePitch="360"/>
-        </w:sectPr>
-      </w:pPr>
+        <w:t>Fig. 6. Lima belas fitur dengan feature importance tertinggi pada Random Forest.</w:t>
+      </w:r>
     </w:p>
     <w:p>
       <w:pPr>
@@ -5530,6 +5837,11 @@
     </w:tbl>
     <w:p>
       <w:pPr>
+        <w:spacing w:before="0" w:after="140" w:line="240" w:lineRule="auto"/>
+      </w:pPr>
+    </w:p>
+    <w:p>
+      <w:pPr>
         <w:pStyle w:val="Heading2"/>
         <w:keepNext/>
         <w:spacing w:before="100" w:after="40"/>
@@ -5693,7 +6005,7 @@
           <w:color w:val="000000"/>
           <w:sz w:val="20"/>
         </w:rPr>
-        <w:t>Fig. 4 menyatukan KPI, level risiko, prioritas module-presentation, distribusi probabilitas, sinyal dominan, perbandingan perilaku, confusion matrix, dan trade-off model dengan knowledge layer. Tampilan ini menyediakan ringkasan strategis sekaligus dasar penelusuran prioritas operasional.</w:t>
+        <w:t>Keluaran analitik kemudian diterjemahkan ke dalam dashboard agar hasil model dapat dibaca sebagai prioritas tindakan, bukan hanya sebagai angka evaluasi. Tampilan tersebut menghubungkan KPI risiko, level prioritas, konsentrasi module-presentation, distribusi probabilitas, sinyal dominan, perbandingan perilaku, confusion matrix, dan trade-off setelah knowledge layer. Dengan susunan ini, pengguna dapat bergerak dari ringkasan strategis menuju penelusuran kelompok atau mahasiswa yang membutuhkan tindak lanjut.</w:t>
       </w:r>
     </w:p>
     <w:p>
@@ -5717,7 +6029,7 @@
         <w:drawing>
           <wp:inline xmlns:a="http://schemas.openxmlformats.org/drawingml/2006/main" xmlns:pic="http://schemas.openxmlformats.org/drawingml/2006/picture">
             <wp:extent cx="5486400" cy="4940761"/>
-            <wp:docPr id="4" name="Picture 4" descr="Fig. 4. Dashboard early warning OULAD pada akhir minggu keempat." title="Fig"/>
+            <wp:docPr id="7" name="Picture 7" descr="Fig. 7. Dashboard early warning OULAD pada akhir minggu keempat." title="Fig"/>
             <wp:cNvGraphicFramePr>
               <a:graphicFrameLocks noChangeAspect="1"/>
             </wp:cNvGraphicFramePr>
@@ -5729,7 +6041,7 @@
                     <pic:cNvPicPr/>
                   </pic:nvPicPr>
                   <pic:blipFill>
-                    <a:blip r:embed="rId12"/>
+                    <a:blip r:embed="rId15"/>
                     <a:stretch>
                       <a:fillRect/>
                     </a:stretch>
@@ -5762,7 +6074,7 @@
           <w:color w:val="000000"/>
           <w:sz w:val="16"/>
         </w:rPr>
-        <w:t>Fig. 4. Dashboard early warning OULAD pada akhir minggu keempat.</w:t>
+        <w:t>Fig. 7. Dashboard early warning OULAD pada akhir minggu keempat.</w:t>
       </w:r>
     </w:p>
     <w:p>

</xml_diff>

<commit_message>
docs: polish IEEE article language
</commit_message>
<xml_diff>
--- a/docs/artikel-ieee/Artikel IEEE - 24.55.2714 - Muhammad Rizky Hajar.docx
+++ b/docs/artikel-ieee/Artikel IEEE - 24.55.2714 - Muhammad Rizky Hajar.docx
@@ -419,7 +419,7 @@
           <w:color w:val="000000"/>
           <w:sz w:val="18"/>
         </w:rPr>
-        <w:t xml:space="preserve">Dropout mahasiswa memengaruhi keberlanjutan studi, efektivitas layanan akademik, dan pengambilan keputusan institusional. Penelitian ini mengembangkan early warning risiko dropout mahasiswa pada akhir minggu keempat menggunakan Open University Learning Analytics Dataset (OULAD). Target dirumuskan sebagai klasifikasi biner, yaitu </w:t>
+        <w:t xml:space="preserve">Dropout mahasiswa memengaruhi keberlanjutan studi, efektivitas layanan akademik, dan pengambilan keputusan institusional. Penelitian ini mengembangkan sistem peringatan dini risiko dropout mahasiswa pada akhir minggu keempat menggunakan Open University Learning Analytics Dataset (OULAD). Target dirumuskan sebagai klasifikasi biner, yaitu </w:t>
       </w:r>
       <w:r>
         <w:rPr>
@@ -539,7 +539,7 @@
           <w:color w:val="000000"/>
           <w:sz w:val="18"/>
         </w:rPr>
-        <w:t xml:space="preserve">. Fitur prediktor dibentuk dari data demografis, registrasi awal, assessment, dan aktivitas Virtual Learning Environment yang tersedia sampai hari ke-28. Evaluasi membandingkan Logistic Regression, Random Forest, dan XGBoost melalui hold-out test berbasis kelompok mahasiswa dan 5-fold GroupKFold. Random Forest dipilih berdasarkan recall </w:t>
+        <w:t xml:space="preserve">. Fitur prediktor dibentuk dari data demografis, registrasi awal, assessment, dan aktivitas Virtual Learning Environment yang tersedia sampai hari ke-28. Evaluasi membandingkan Logistic Regression, Random Forest, dan XGBoost melalui pengujian hold-out berbasis kelompok mahasiswa dan 5-fold GroupKFold. Random Forest dipilih berdasarkan recall </w:t>
       </w:r>
       <w:r>
         <w:rPr>
@@ -559,7 +559,7 @@
           <w:color w:val="000000"/>
           <w:sz w:val="18"/>
         </w:rPr>
-        <w:t xml:space="preserve"> cross-validation tertinggi sebesar 0,7126. Pada hold-out test, model tersebut menghasilkan accuracy 0,7592, precision 0,8032, recall 0,7172, F1-score 0,7578, dan ROC-AUC 0,8396. Knowledge-based risk layer menggabungkan prediksi model dengan empat indikator perilaku awal untuk menghasilkan level </w:t>
+        <w:t xml:space="preserve"> cross-validation tertinggi sebesar 0,7126. Pada data uji hold-out, model tersebut menghasilkan accuracy 0,7592, precision 0,8032, recall 0,7172, F1-score 0,7578, dan ROC-AUC 0,8396. Lapisan risiko berbasis aturan menggabungkan prediksi model dengan empat indikator perilaku awal untuk menghasilkan level </w:t>
       </w:r>
       <w:r>
         <w:rPr>
@@ -619,7 +619,7 @@
           <w:color w:val="000000"/>
           <w:sz w:val="18"/>
         </w:rPr>
-        <w:t xml:space="preserve"> beserta alasan dan rekomendasi intervensi. Sistem gabungan meningkatkan recall menjadi 0,7849 dengan precision 0,7039. Hasil analitik disajikan melalui dashboard statis yang memuat indikator risiko, prioritas module-presentation, sinyal dominan, dan daftar mahasiswa untuk mendukung monitoring akademik. Pendekatan ini menyediakan integrasi prediksi, interpretasi berbasis aturan, dan visual decision support untuk intervensi dini.</w:t>
+        <w:t xml:space="preserve"> beserta alasan dan rekomendasi intervensi. Sistem gabungan meningkatkan recall menjadi 0,7849 dengan precision 0,7039. Hasil analitik disajikan melalui dashboard statis yang memuat indikator risiko, prioritas module-presentation, sinyal dominan, dan daftar mahasiswa untuk mendukung monitoring akademik. Pendekatan ini menghubungkan prediksi, interpretasi berbasis aturan, dan visualisasi pendukung keputusan untuk intervensi dini.</w:t>
       </w:r>
     </w:p>
     <w:p>
@@ -679,7 +679,7 @@
           <w:color w:val="000000"/>
           <w:sz w:val="20"/>
         </w:rPr>
-        <w:t>Dropout mahasiswa menjadi isu penting dalam pendidikan tinggi karena berkaitan dengan keberlanjutan studi, kualitas layanan akademik, dan efektivitas pengambilan keputusan institusional. Penelitian sebelumnya menunjukkan bahwa machine learning dapat memprediksi retensi mahasiswa menggunakan karakteristik sosiodemografis dan metrik engagement [1]. Early warning system memperluas manfaat prediksi dengan menempatkan identifikasi risiko pada periode ketika intervensi akademik masih dapat dilakukan [2]. Ketersediaan informasi risiko pada minggu-minggu awal memberi ruang bagi dosen, tutor, dan pengelola program studi untuk merancang tindak lanjut yang relevan.</w:t>
+        <w:t>Dropout mahasiswa menjadi isu penting dalam pendidikan tinggi karena berkaitan dengan keberlanjutan studi, kualitas layanan akademik, dan efektivitas pengambilan keputusan institusional. Penelitian sebelumnya menunjukkan bahwa machine learning dapat memprediksi retensi mahasiswa menggunakan karakteristik sosiodemografis dan metrik engagement [1]. Sistem peringatan dini memperluas manfaat prediksi dengan menempatkan identifikasi risiko pada periode ketika intervensi akademik masih dapat dilakukan [2]. Ketersediaan informasi risiko pada minggu-minggu awal memberi ruang bagi dosen, tutor, dan pengelola program studi untuk merancang tindak lanjut yang relevan.</w:t>
       </w:r>
     </w:p>
     <w:p>
@@ -696,7 +696,7 @@
           <w:color w:val="000000"/>
           <w:sz w:val="20"/>
         </w:rPr>
-        <w:t>Sistem pembelajaran digital menghasilkan data akademik dan jejak aktivitas yang dapat digunakan untuk membaca engagement mahasiswa. Data tersebut mencakup interaksi dengan Virtual Learning Environment (VLE), partisipasi assessment, performa penilaian, dan informasi registrasi awal. Studi mengenai digital traces memperlihatkan bahwa pola aktivitas Learning Management System dapat membantu memahami variasi performa dan risiko mahasiswa [3]. Open University Learning Analytics Dataset (OULAD) menyediakan data tersebut dalam struktur relasional yang mencakup profil mahasiswa, assessment, registrasi, dan lebih dari sepuluh juta catatan aktivitas VLE [4].</w:t>
+        <w:t>Sistem pembelajaran digital menghasilkan data akademik dan jejak aktivitas yang dapat digunakan untuk memahami engagement mahasiswa. Data tersebut mencakup interaksi dengan Virtual Learning Environment (VLE), partisipasi assessment, performa penilaian, dan informasi registrasi awal. Studi mengenai jejak digital memperlihatkan bahwa pola aktivitas Learning Management System dapat membantu menjelaskan variasi performa dan risiko mahasiswa [3]. Open University Learning Analytics Dataset (OULAD) menyediakan data tersebut dalam struktur relasional yang mencakup profil mahasiswa, assessment, registrasi, dan lebih dari sepuluh juta catatan aktivitas VLE [4].</w:t>
       </w:r>
     </w:p>
     <w:p>
@@ -713,7 +713,7 @@
           <w:color w:val="000000"/>
           <w:sz w:val="20"/>
         </w:rPr>
-        <w:t>Nilai prediktif suatu model bergantung pada kesesuaian data dengan waktu keputusan. Penggunaan aktivitas seluruh semester atau status unregistration menghasilkan informasi yang kuat untuk klasifikasi retrospektif, sedangkan early warning memerlukan fitur yang telah tersedia pada waktu prediksi. Penelitian ini menggunakan cut-off hari ke-28 untuk merepresentasikan akhir minggu keempat. Assessment dan aktivitas VLE setelah cut-off dikeluarkan dari fitur, sedangkan status unregistration diperlakukan sebagai informasi masa depan. Pembatasan temporal tersebut menghasilkan estimasi performa yang lebih dekat dengan kondisi intervensi dini.</w:t>
+        <w:t>Nilai prediktif suatu model bergantung pada kesesuaian data dengan waktu keputusan. Penggunaan aktivitas seluruh semester atau status unregistration menghasilkan informasi yang kuat untuk klasifikasi retrospektif, sedangkan sistem peringatan dini memerlukan fitur yang telah tersedia pada waktu prediksi. Penelitian ini menggunakan batas hari ke-28 untuk merepresentasikan akhir minggu keempat. Assessment dan aktivitas VLE setelah batas tersebut dikeluarkan dari fitur, sedangkan status unregistration diperlakukan sebagai informasi masa depan. Pembatasan temporal tersebut menghasilkan estimasi performa yang lebih dekat dengan kondisi intervensi dini.</w:t>
       </w:r>
     </w:p>
     <w:p>
@@ -730,7 +730,7 @@
           <w:color w:val="000000"/>
           <w:sz w:val="20"/>
         </w:rPr>
-        <w:t>Literatur menunjukkan bahwa kemampuan mendeteksi mahasiswa berisiko perlu dihubungkan dengan proses tindak lanjut agar memberi dampak institusional [2]. Model machine learning menghasilkan kelas dan probabilitas, sedangkan pemangku kepentingan memerlukan alasan risiko, prioritas, dan rekomendasi yang dapat dibaca secara operasional. Kebutuhan tersebut membentuk research gap pada integrasi antara evaluasi model, interpretasi berbasis aturan, dan penyajian visual untuk decision support.</w:t>
+        <w:t>Literatur menunjukkan bahwa kemampuan mendeteksi mahasiswa berisiko perlu dihubungkan dengan proses tindak lanjut agar memberi dampak institusional [2]. Model machine learning menghasilkan kelas dan probabilitas, sedangkan pemangku kepentingan memerlukan alasan risiko, prioritas, dan rekomendasi yang dapat digunakan dalam kerja operasional. Kebutuhan tersebut membentuk celah penelitian pada integrasi antara evaluasi model, interpretasi berbasis aturan, dan penyajian visual untuk mendukung keputusan.</w:t>
       </w:r>
     </w:p>
     <w:p>
@@ -747,7 +747,7 @@
           <w:color w:val="000000"/>
           <w:sz w:val="20"/>
         </w:rPr>
-        <w:t>Penelitian ini bertujuan mengembangkan klasifikasi biner risiko dropout mahasiswa pada minggu keempat, mengevaluasi tiga algoritma supervised learning, dan mengintegrasikan model terpilih dengan knowledge-based risk layer. Hasil sistem diterjemahkan menjadi dashboard Business Intelligence untuk monitoring risiko dan prioritas intervensi akademik.</w:t>
+        <w:t>Penelitian ini bertujuan mengembangkan klasifikasi biner risiko dropout mahasiswa pada minggu keempat, mengevaluasi tiga algoritma supervised learning, dan mengintegrasikan model terpilih dengan lapisan risiko berbasis aturan. Hasil sistem disajikan dalam dashboard Business Intelligence untuk monitoring risiko dan prioritas intervensi akademik.</w:t>
       </w:r>
     </w:p>
     <w:p>
@@ -764,7 +764,7 @@
           <w:color w:val="000000"/>
           <w:sz w:val="20"/>
         </w:rPr>
-        <w:t xml:space="preserve">Kontribusi penelitian terdiri atas empat bagian. Pertama, penelitian membentuk dataset early warning pada unit student-module-presentation dengan cut-off hari ke-28. Kedua, evaluasi menggunakan pemisahan berbasis </w:t>
+        <w:t xml:space="preserve">Kontribusi penelitian terdiri atas empat bagian. Pertama, penelitian membentuk dataset peringatan dini pada unit student-module-presentation dengan batas hari ke-28. Kedua, evaluasi menggunakan pemisahan berbasis </w:t>
       </w:r>
       <w:r>
         <w:rPr>
@@ -784,7 +784,7 @@
           <w:color w:val="000000"/>
           <w:sz w:val="20"/>
         </w:rPr>
-        <w:t xml:space="preserve"> untuk menjaga independensi mahasiswa antara data pelatihan dan pengujian. Ketiga, knowledge-based risk layer menghasilkan level, alasan risiko, dan rekomendasi berdasarkan prediksi model serta perilaku awal. Keempat, dashboard mengubah keluaran analitik menjadi indikator yang mendukung keputusan pimpinan akademik, program studi, tutor, dosen wali, dan tim konseling.</w:t>
+        <w:t xml:space="preserve"> untuk menjaga independensi mahasiswa antara data pelatihan dan pengujian. Ketiga, lapisan risiko berbasis aturan menghasilkan level, alasan risiko, dan rekomendasi berdasarkan prediksi model serta perilaku awal. Keempat, dashboard mengubah keluaran analitik menjadi indikator yang mendukung keputusan pimpinan akademik, program studi, tutor, dosen wali, dan tim konseling.</w:t>
       </w:r>
     </w:p>
     <w:p>
@@ -835,7 +835,7 @@
           <w:color w:val="000000"/>
           <w:sz w:val="20"/>
         </w:rPr>
-        <w:t>Early warning system mengarahkan hasil prediksi pada proses intervensi. Plak et al. menunjukkan bahwa informasi risiko perlu disertai rancangan tindak lanjut agar dapat memengaruhi hasil akademik [2]. Temuan tersebut menegaskan peran proses bisnis, kapasitas intervensi, dan komunikasi informasi kepada konselor atau pengelola akademik. Model dengan recall tinggi memberi cakupan deteksi yang luas, sedangkan precision menentukan proporsi alarm yang relevan untuk ditindaklanjuti.</w:t>
+        <w:t>Sistem peringatan dini mengarahkan hasil prediksi pada proses intervensi. Plak et al. menunjukkan bahwa informasi risiko perlu disertai rancangan tindak lanjut agar dapat memengaruhi hasil akademik [2]. Temuan tersebut menegaskan peran proses bisnis, kapasitas intervensi, dan komunikasi informasi kepada konselor atau pengelola akademik. Model dengan recall tinggi memberi cakupan deteksi yang luas, sedangkan precision menentukan proporsi alarm yang relevan untuk ditindaklanjuti.</w:t>
       </w:r>
     </w:p>
     <w:p>
@@ -852,7 +852,7 @@
           <w:color w:val="000000"/>
           <w:sz w:val="20"/>
         </w:rPr>
-        <w:t>Aktivitas Learning Management System atau VLE banyak digunakan sebagai sumber fitur karena merepresentasikan pola engagement mahasiswa. Data klik, frekuensi aktivitas, hari aktif, jenis materi, dan pola interaksi dapat mendukung analisis performa akademik [3]. XGBoost telah digunakan untuk early warning berbasis data pra-enrollment [6], AutoML mendukung eksplorasi educational analytics [7], dan statistical learning serta deep learning digunakan pada precision education [8]. Random Forest juga sesuai untuk data tabular yang memuat kombinasi fitur akademik dan sosiodemografis [9].</w:t>
+        <w:t>Aktivitas Learning Management System atau VLE banyak digunakan sebagai sumber fitur karena merepresentasikan pola engagement mahasiswa. Data klik, frekuensi aktivitas, hari aktif, jenis materi, dan pola interaksi dapat mendukung analisis performa akademik [3]. XGBoost telah digunakan untuk peringatan dini berbasis data pra-enrollment [6], AutoML mendukung eksplorasi educational analytics [7], dan statistical learning serta deep learning digunakan pada precision education [8]. Random Forest juga sesuai untuk data tabular yang memuat kombinasi fitur akademik dan sosiodemografis [9].</w:t>
       </w:r>
     </w:p>
     <w:p>
@@ -886,7 +886,7 @@
           <w:color w:val="000000"/>
           <w:sz w:val="20"/>
         </w:rPr>
-        <w:t>Penelitian ini mengambil posisi pada integrasi tiga komponen. Supervised learning digunakan untuk menghasilkan probabilitas risiko, knowledge-based risk layer menerjemahkan probabilitas dan sinyal perilaku menjadi alasan serta level prioritas, dan dashboard menyajikan hasil sebagai visual decision support. Cut-off minggu keempat menjaga kesesuaian temporal antara fitur dan waktu intervensi. Integrasi tersebut menghubungkan evaluasi teknis dengan kebutuhan monitoring akademik yang dapat ditindaklanjuti.</w:t>
+        <w:t>Penelitian ini mengambil posisi pada integrasi tiga komponen. Supervised learning digunakan untuk menghasilkan probabilitas risiko, lapisan risiko berbasis aturan menerjemahkan probabilitas dan sinyal perilaku menjadi alasan serta level prioritas, dan dashboard menyajikan hasil sebagai dasar pendukung keputusan. Batas minggu keempat menjaga kesesuaian temporal antara fitur dan waktu intervensi. Integrasi tersebut menghubungkan evaluasi teknis dengan kebutuhan monitoring akademik yang dapat ditindaklanjuti.</w:t>
       </w:r>
     </w:p>
     <w:p>
@@ -937,7 +937,7 @@
           <w:color w:val="000000"/>
           <w:sz w:val="20"/>
         </w:rPr>
-        <w:t xml:space="preserve">Penelitian menggunakan desain supervised binary classification untuk mendeteksi risiko dropout pada akhir minggu keempat. Alur penelitian meliputi pengambilan dan audit OULAD, pembentukan fitur dengan cut-off temporal, exploratory data analysis, pemisahan data berbasis mahasiswa, pelatihan dan evaluasi model, pembentukan knowledge-based risk layer, serta penyajian indikator melalui dashboard Business Intelligence. Seluruh eksperimen menggunakan </w:t>
+        <w:t xml:space="preserve">Penelitian menggunakan desain supervised binary classification untuk mendeteksi risiko dropout pada akhir minggu keempat. Alur penelitian meliputi pengambilan dan audit OULAD, pembentukan fitur dengan batas temporal, exploratory data analysis, pemisahan data berbasis mahasiswa, pelatihan dan evaluasi model, pembentukan lapisan risiko berbasis aturan, serta penyajian indikator melalui dashboard Business Intelligence. Seluruh eksperimen menggunakan </w:t>
       </w:r>
       <w:r>
         <w:rPr>
@@ -1228,7 +1228,7 @@
           <w:color w:val="000000"/>
           <w:sz w:val="20"/>
         </w:rPr>
-        <w:t xml:space="preserve">. Satu baris hasil preprocessing merepresentasikan satu student-module-presentation. Struktur ini mengikuti unit label pada </w:t>
+        <w:t xml:space="preserve">. Satu baris data hasil olahan merepresentasikan satu student-module-presentation. Struktur ini mengikuti unit label pada </w:t>
       </w:r>
       <w:r>
         <w:rPr>
@@ -1265,7 +1265,7 @@
           <w:color w:val="000000"/>
           <w:sz w:val="20"/>
         </w:rPr>
-        <w:t>C. Target Label and Temporal Cut-off</w:t>
+        <w:t>C. Target Label and Temporal Boundary</w:t>
       </w:r>
     </w:p>
     <w:p>
@@ -1499,7 +1499,7 @@
           <w:color w:val="000000"/>
           <w:sz w:val="20"/>
         </w:rPr>
-        <w:t xml:space="preserve">Horizon early warning ditetapkan pada hari ke-28. Submission assessment dipilih dengan kondisi </w:t>
+        <w:t xml:space="preserve">Horizon peringatan dini ditetapkan pada hari ke-28. Submission assessment dipilih dengan kondisi </w:t>
       </w:r>
       <w:r>
         <w:rPr>
@@ -2127,7 +2127,7 @@
           <w:color w:val="000000"/>
           <w:sz w:val="20"/>
         </w:rPr>
-        <w:t xml:space="preserve"> dengan nilai yang tidak dapat dikonversi diperlakukan sebagai missing value. Agregat perilaku yang belum memiliki aktivitas diisi dengan nol. Pada pipeline model, missing value numerik diimputasi menggunakan median dan kemudian distandardisasi. Missing value kategorikal diimputasi menggunakan modus dan ditransformasikan dengan one-hot encoding. Seluruh transformasi dipelajari di dalam pipeline pada data pelatihan.</w:t>
+        <w:t>; nilai yang tidak dapat dikonversi diperlakukan sebagai data hilang. Agregat perilaku yang belum memiliki aktivitas diisi dengan nol. Dalam alur pemodelan, data hilang pada fitur numerik diimputasi menggunakan median dan kemudian distandardisasi. Data hilang pada fitur kategorikal diimputasi menggunakan modus dan ditransformasikan dengan one-hot encoding. Seluruh transformasi dipelajari hanya dari data pelatihan.</w:t>
       </w:r>
     </w:p>
     <w:p>
@@ -2161,7 +2161,7 @@
           <w:color w:val="000000"/>
           <w:sz w:val="20"/>
         </w:rPr>
-        <w:t xml:space="preserve">Data dibagi menjadi 80% train-validation dan 20% hold-out test menggunakan </w:t>
+        <w:t xml:space="preserve">Data dibagi menjadi 80% data latih-validasi dan 20% data uji hold-out menggunakan </w:t>
       </w:r>
       <w:r>
         <w:rPr>
@@ -2201,7 +2201,7 @@
           <w:color w:val="000000"/>
           <w:sz w:val="20"/>
         </w:rPr>
-        <w:t xml:space="preserve"> digunakan sebagai grup sehingga setiap mahasiswa ditempatkan secara eksklusif pada salah satu bagian. Train-validation terdiri atas 26.122 baris dan test terdiri atas 6.471 baris. Pemeriksaan menunjukkan overlap mahasiswa sebesar nol.</w:t>
+        <w:t xml:space="preserve"> digunakan sebagai grup sehingga setiap mahasiswa ditempatkan secara eksklusif pada salah satu bagian. Data latih-validasi terdiri atas 26.122 baris dan data uji terdiri atas 6.471 baris. Pemeriksaan menunjukkan tidak ada mahasiswa yang muncul di kedua bagian.</w:t>
       </w:r>
     </w:p>
     <w:p>
@@ -2238,7 +2238,7 @@
           <w:color w:val="000000"/>
           <w:sz w:val="20"/>
         </w:rPr>
-        <w:t xml:space="preserve"> pada train-validation. Pemilihan model didasarkan pada rata-rata recall kelas </w:t>
+        <w:t xml:space="preserve"> pada data latih-validasi. Pemilihan model didasarkan pada rata-rata recall kelas </w:t>
       </w:r>
       <w:r>
         <w:rPr>
@@ -2278,7 +2278,7 @@
           <w:color w:val="000000"/>
           <w:sz w:val="20"/>
         </w:rPr>
-        <w:t xml:space="preserve"> digunakan sebagai tie-breaker. Setelah model terpilih, performa akhir dilaporkan pada hold-out test.</w:t>
+        <w:t xml:space="preserve"> digunakan sebagai penentu ketika nilai recall berdekatan. Setelah model terpilih, performa akhir dilaporkan pada data uji hold-out.</w:t>
       </w:r>
     </w:p>
     <w:p>
@@ -2312,7 +2312,7 @@
           <w:color w:val="000000"/>
           <w:sz w:val="20"/>
         </w:rPr>
-        <w:t xml:space="preserve">Tiga algoritma dibandingkan. Logistic Regression digunakan sebagai baseline linear dengan </w:t>
+        <w:t xml:space="preserve">Tiga algoritma dibandingkan. Logistic Regression digunakan sebagai pembanding linear dengan </w:t>
       </w:r>
       <w:r>
         <w:rPr>
@@ -2372,7 +2372,7 @@
           <w:color w:val="000000"/>
           <w:sz w:val="20"/>
         </w:rPr>
-        <w:t xml:space="preserve"> dihitung dari distribusi kelas train-validation.</w:t>
+        <w:t xml:space="preserve"> dihitung dari distribusi kelas pada data latih-validasi.</w:t>
       </w:r>
     </w:p>
     <w:p>
@@ -2409,7 +2409,7 @@
           <w:color w:val="000000"/>
           <w:sz w:val="20"/>
         </w:rPr>
-        <w:t xml:space="preserve">, ROC-AUC, confusion matrix, serta classification report. Recall </w:t>
+        <w:t xml:space="preserve">, ROC-AUC, confusion matrix, serta ringkasan klasifikasi. Recall </w:t>
       </w:r>
       <w:r>
         <w:rPr>
@@ -2429,7 +2429,7 @@
           <w:color w:val="000000"/>
           <w:sz w:val="20"/>
         </w:rPr>
-        <w:t xml:space="preserve"> menjadi kriteria utama karena early warning memprioritaskan cakupan mahasiswa berisiko yang dapat diarahkan pada proses verifikasi dan intervensi.</w:t>
+        <w:t xml:space="preserve"> menjadi kriteria utama karena sistem peringatan dini memprioritaskan cakupan mahasiswa berisiko yang dapat diarahkan pada proses verifikasi dan intervensi.</w:t>
       </w:r>
     </w:p>
     <w:p>
@@ -2446,7 +2446,7 @@
           <w:color w:val="000000"/>
           <w:sz w:val="20"/>
         </w:rPr>
-        <w:t>G. Knowledge-Based Risk Layer</w:t>
+        <w:t>G. Rule-Based Risk Layer</w:t>
       </w:r>
     </w:p>
     <w:p>
@@ -2463,7 +2463,7 @@
           <w:color w:val="000000"/>
           <w:sz w:val="20"/>
         </w:rPr>
-        <w:t xml:space="preserve">Knowledge-based risk layer menggunakan empat indikator: </w:t>
+        <w:t xml:space="preserve">Lapisan risiko berbasis aturan menggunakan empat indikator: </w:t>
       </w:r>
       <w:r>
         <w:rPr>
@@ -2543,7 +2543,7 @@
           <w:color w:val="000000"/>
           <w:sz w:val="20"/>
         </w:rPr>
-        <w:t>. Threshold dihitung dari kuartil bawah data train-validation. Prosedur ini menjaga threshold tetap independen dari hold-out test. Hasil perhitungan menghasilkan threshold skor assessment 0, jumlah assessment 0, total klik VLE 47, dan hari aktif VLE 4.</w:t>
+        <w:t>. Ambang batas dihitung dari kuartil bawah data latih-validasi. Prosedur ini menjaga ambang batas tetap independen dari data uji hold-out. Hasil perhitungan menghasilkan ambang batas skor assessment 0, jumlah assessment 0, total klik VLE 47, dan hari aktif VLE 4.</w:t>
       </w:r>
     </w:p>
     <w:p>
@@ -2560,7 +2560,7 @@
           <w:color w:val="000000"/>
           <w:sz w:val="20"/>
         </w:rPr>
-        <w:t xml:space="preserve">Sinyal risiko diberikan ketika nilai indikator berada pada atau di bawah threshold. Status </w:t>
+        <w:t xml:space="preserve">Sinyal risiko muncul ketika nilai indikator sama dengan atau lebih rendah dari ambang batas. Status </w:t>
       </w:r>
       <w:r>
         <w:rPr>
@@ -2774,7 +2774,7 @@
           <w:color w:val="000000"/>
           <w:sz w:val="20"/>
         </w:rPr>
-        <w:t>. Perbandingan dengan model terpilih digunakan untuk mengukur perubahan cakupan deteksi, precision, dan beban verifikasi.</w:t>
+        <w:t>. Perbandingan dengan model terpilih digunakan untuk mengukur perubahan cakupan deteksi, precision, dan kebutuhan verifikasi.</w:t>
       </w:r>
     </w:p>
     <w:p>
@@ -2808,7 +2808,7 @@
           <w:color w:val="000000"/>
           <w:sz w:val="20"/>
         </w:rPr>
-        <w:t>Dashboard statis dibangun menggunakan Matplotlib dan Seaborn. Dashboard memuat KPI mahasiswa unik, jumlah dan persentase prioritas intervensi, distribusi level risiko, risiko per module-presentation, distribusi probabilitas, sinyal dominan, median aktivitas VLE dan assessment, confusion matrix, serta perbandingan model dengan knowledge layer.</w:t>
+        <w:t>Dashboard statis dibangun menggunakan Matplotlib dan Seaborn. Dashboard memuat KPI mahasiswa unik, jumlah dan persentase prioritas intervensi, distribusi level risiko, risiko per module-presentation, distribusi probabilitas, sinyal dominan, median aktivitas VLE dan assessment, confusion matrix, serta perbandingan model dengan lapisan risiko berbasis aturan.</w:t>
       </w:r>
     </w:p>
     <w:p>
@@ -2845,7 +2845,7 @@
           <w:color w:val="000000"/>
           <w:sz w:val="20"/>
         </w:rPr>
-        <w:t>, dan jumlah sinyal. Keluaran tersebut mendukung beberapa tingkat keputusan. Pimpinan akademik memperoleh gambaran skala risiko, program studi melihat konsentrasi risiko antar module-presentation, dan tutor atau dosen wali memperoleh alasan serta rekomendasi pada tingkat mahasiswa. Sistem diposisikan sebagai decision support yang membantu stakeholder menetapkan tindak lanjut berdasarkan bukti analitik dan pertimbangan akademik.</w:t>
+        <w:t>, dan jumlah sinyal. Keluaran tersebut mendukung beberapa tingkat keputusan. Pimpinan akademik memperoleh gambaran skala risiko, program studi melihat konsentrasi risiko antar module-presentation, dan tutor atau dosen wali memperoleh alasan serta rekomendasi pada tingkat mahasiswa. Sistem diposisikan sebagai pendukung keputusan yang membantu pemangku kepentingan menetapkan tindak lanjut berdasarkan bukti analitik dan pertimbangan akademik.</w:t>
       </w:r>
     </w:p>
     <w:p>
@@ -2896,7 +2896,7 @@
           <w:color w:val="000000"/>
           <w:sz w:val="20"/>
         </w:rPr>
-        <w:t xml:space="preserve">Dataset hasil preprocessing memuat 32.593 student-module-presentation dari 28.785 mahasiswa unik. Kelas </w:t>
+        <w:t xml:space="preserve">Dataset hasil olahan memuat 32.593 student-module-presentation dari 28.785 mahasiswa unik. Kelas </w:t>
       </w:r>
       <w:r>
         <w:rPr>
@@ -2936,7 +2936,7 @@
           <w:color w:val="000000"/>
           <w:sz w:val="20"/>
         </w:rPr>
-        <w:t xml:space="preserve"> berjumlah 15.385 baris. Train-validation memuat 26.122 baris, sedangkan hold-out test memuat 6.471 baris dengan 3.398 kasus </w:t>
+        <w:t xml:space="preserve"> berjumlah 15.385 baris. Data latih-validasi memuat 26.122 baris, sedangkan data uji hold-out memuat 6.471 baris dengan 3.398 kasus </w:t>
       </w:r>
       <w:r>
         <w:rPr>
@@ -2996,7 +2996,7 @@
           <w:color w:val="000000"/>
           <w:sz w:val="20"/>
         </w:rPr>
-        <w:t xml:space="preserve"> menghasilkan overlap mahasiswa sebesar nol.</w:t>
+        <w:t xml:space="preserve"> memastikan tidak ada mahasiswa yang muncul pada kedua bagian data.</w:t>
       </w:r>
     </w:p>
     <w:p>
@@ -3108,7 +3108,7 @@
           <w:color w:val="000000"/>
           <w:sz w:val="20"/>
         </w:rPr>
-        <w:t xml:space="preserve">Pemeriksaan kualitas data kemudian dilakukan sebelum model dilatih. Missing value terutama muncul pada </w:t>
+        <w:t xml:space="preserve">Pemeriksaan kualitas data kemudian dilakukan sebelum model dilatih. Data hilang terutama muncul pada </w:t>
       </w:r>
       <w:r>
         <w:rPr>
@@ -3148,7 +3148,7 @@
           <w:color w:val="000000"/>
           <w:sz w:val="20"/>
         </w:rPr>
-        <w:t>. Dua kondisi tersebut ditangani di dalam pipeline berdasarkan data train-validation agar proses imputasi tidak membawa informasi dari hold-out test.</w:t>
+        <w:t>. Dua kondisi tersebut ditangani dalam alur pemodelan berdasarkan data latih-validasi agar proses imputasi tidak dipengaruhi oleh data uji hold-out.</w:t>
       </w:r>
     </w:p>
     <w:p>
@@ -3161,7 +3161,7 @@
         <w:drawing>
           <wp:inline xmlns:a="http://schemas.openxmlformats.org/drawingml/2006/main" xmlns:pic="http://schemas.openxmlformats.org/drawingml/2006/picture">
             <wp:extent cx="2971800" cy="1649091"/>
-            <wp:docPr id="2" name="Picture 2" descr="Fig. 2. Missing value pada fitur dataset pemodelan." title="Fig"/>
+            <wp:docPr id="2" name="Picture 2" descr="Fig. 2. Data hilang pada fitur dataset pemodelan." title="Fig"/>
             <wp:cNvGraphicFramePr>
               <a:graphicFrameLocks noChangeAspect="1"/>
             </wp:cNvGraphicFramePr>
@@ -3206,7 +3206,7 @@
           <w:color w:val="000000"/>
           <w:sz w:val="16"/>
         </w:rPr>
-        <w:t>Fig. 2. Missing value pada fitur dataset pemodelan.</w:t>
+        <w:t>Fig. 2. Data hilang pada fitur dataset pemodelan.</w:t>
       </w:r>
     </w:p>
     <w:p>
@@ -3260,7 +3260,7 @@
           <w:color w:val="000000"/>
           <w:sz w:val="20"/>
         </w:rPr>
-        <w:t xml:space="preserve"> tertinggi sebesar 0,7126 dan F1-score 0,7536. XGBoost menghasilkan accuracy dan ROC-AUC tertinggi, masing-masing sebesar 0,7582 dan 0,8440. Berdasarkan kriteria pemilihan yang memprioritaskan recall, Random Forest dipilih sebagai model final.</w:t>
+        <w:t xml:space="preserve"> tertinggi sebesar 0,7126 dan F1-score 0,7536. XGBoost menghasilkan accuracy dan ROC-AUC tertinggi, masing-masing sebesar 0,7582 dan 0,8440. Berdasarkan kriteria pemilihan yang memprioritaskan recall, Random Forest dipilih sebagai model akhir.</w:t>
       </w:r>
     </w:p>
     <w:p>
@@ -3284,7 +3284,7 @@
           <w:color w:val="000000"/>
           <w:sz w:val="16"/>
         </w:rPr>
-        <w:t>HASIL 5-FOLD GROUPKFOLD PADA TRAIN-VALIDATION</w:t>
+        <w:t>HASIL 5-FOLD GROUPKFOLD PADA DATA LATIH-VALIDASI</w:t>
       </w:r>
     </w:p>
     <w:tbl>
@@ -4036,7 +4036,7 @@
           <w:color w:val="000000"/>
           <w:sz w:val="20"/>
         </w:rPr>
-        <w:t>C. Hold-Out Test Performance</w:t>
+        <w:t>C. Hold-Out Evaluation</w:t>
       </w:r>
     </w:p>
     <w:p>
@@ -4053,7 +4053,7 @@
           <w:color w:val="000000"/>
           <w:sz w:val="20"/>
         </w:rPr>
-        <w:t xml:space="preserve">Tabel II memperlihatkan performa pada hold-out test. Random Forest mencapai accuracy 0,7592, precision </w:t>
+        <w:t xml:space="preserve">Tabel II memperlihatkan performa pada data uji hold-out. Random Forest mencapai accuracy 0,7592, precision </w:t>
       </w:r>
       <w:r>
         <w:rPr>
@@ -4093,7 +4093,7 @@
           <w:color w:val="000000"/>
           <w:sz w:val="20"/>
         </w:rPr>
-        <w:t xml:space="preserve"> berada pada 0,7054. Logistic Regression menghasilkan recall terendah sebesar 0,6869.</w:t>
+        <w:t xml:space="preserve"> mencapai 0,7054. Logistic Regression menghasilkan recall terendah sebesar 0,6869.</w:t>
       </w:r>
     </w:p>
     <w:p>
@@ -4117,7 +4117,7 @@
           <w:color w:val="000000"/>
           <w:sz w:val="16"/>
         </w:rPr>
-        <w:t>PERFORMA MODEL PADA HOLD-OUT TEST</w:t>
+        <w:t>PERFORMA MODEL PADA DATA UJI HOLD-OUT</w:t>
       </w:r>
     </w:p>
     <w:tbl>
@@ -4869,7 +4869,7 @@
           <w:color w:val="000000"/>
           <w:sz w:val="20"/>
         </w:rPr>
-        <w:t xml:space="preserve">Classification report Random Forest menunjukkan precision 0,80, recall 0,72, dan F1-score 0,76 pada 3.398 kasus </w:t>
+        <w:t xml:space="preserve">Ringkasan klasifikasi Random Forest menunjukkan precision 0,80, recall 0,72, dan F1-score 0,76 pada 3.398 kasus </w:t>
       </w:r>
       <w:r>
         <w:rPr>
@@ -4909,7 +4909,7 @@
           <w:color w:val="000000"/>
           <w:sz w:val="20"/>
         </w:rPr>
-        <w:t xml:space="preserve">, precision mencapai 0,72, recall 0,81, dan F1-score 0,76. Weighted average F1-score mencapai 0,76. Perbandingan metrik antar model menempatkan Random Forest sebagai pilihan yang paling relevan untuk konteks early warning karena recall </w:t>
+        <w:t xml:space="preserve">, precision mencapai 0,72, recall 0,81, dan F1-score 0,76. Rata-rata tertimbang F1-score mencapai 0,76. Perbandingan metrik antar model menempatkan Random Forest sebagai pilihan yang paling relevan untuk konteks peringatan dini karena recall </w:t>
       </w:r>
       <w:r>
         <w:rPr>
@@ -4942,7 +4942,7 @@
         <w:drawing>
           <wp:inline xmlns:a="http://schemas.openxmlformats.org/drawingml/2006/main" xmlns:pic="http://schemas.openxmlformats.org/drawingml/2006/picture">
             <wp:extent cx="2971800" cy="2176023"/>
-            <wp:docPr id="3" name="Picture 3" descr="Fig. 3. Perbandingan metrik AtRisk pada hold-out test." title="Fig"/>
+            <wp:docPr id="3" name="Picture 3" descr="Fig. 3. Perbandingan metrik AtRisk pada data uji hold-out." title="Fig"/>
             <wp:cNvGraphicFramePr>
               <a:graphicFrameLocks noChangeAspect="1"/>
             </wp:cNvGraphicFramePr>
@@ -4987,7 +4987,7 @@
           <w:color w:val="000000"/>
           <w:sz w:val="16"/>
         </w:rPr>
-        <w:t>Fig. 3. Perbandingan metrik AtRisk pada hold-out test.</w:t>
+        <w:t>Fig. 3. Perbandingan metrik AtRisk pada data uji hold-out.</w:t>
       </w:r>
     </w:p>
     <w:p>
@@ -5037,7 +5037,7 @@
         <w:drawing>
           <wp:inline xmlns:a="http://schemas.openxmlformats.org/drawingml/2006/main" xmlns:pic="http://schemas.openxmlformats.org/drawingml/2006/picture">
             <wp:extent cx="2971800" cy="2176023"/>
-            <wp:docPr id="4" name="Picture 4" descr="Fig. 4. Confusion matrix Random Forest pada hold-out test." title="Fig"/>
+            <wp:docPr id="4" name="Picture 4" descr="Fig. 4. Confusion matrix Random Forest pada data uji hold-out." title="Fig"/>
             <wp:cNvGraphicFramePr>
               <a:graphicFrameLocks noChangeAspect="1"/>
             </wp:cNvGraphicFramePr>
@@ -5082,7 +5082,7 @@
           <w:color w:val="000000"/>
           <w:sz w:val="16"/>
         </w:rPr>
-        <w:t>Fig. 4. Confusion matrix Random Forest pada hold-out test.</w:t>
+        <w:t>Fig. 4. Confusion matrix Random Forest pada data uji hold-out.</w:t>
       </w:r>
     </w:p>
     <w:p>
@@ -5112,7 +5112,7 @@
         <w:drawing>
           <wp:inline xmlns:a="http://schemas.openxmlformats.org/drawingml/2006/main" xmlns:pic="http://schemas.openxmlformats.org/drawingml/2006/picture">
             <wp:extent cx="2971800" cy="2172736"/>
-            <wp:docPr id="5" name="Picture 5" descr="Fig. 5. Kurva ROC pada hold-out test." title="Fig"/>
+            <wp:docPr id="5" name="Picture 5" descr="Fig. 5. Kurva ROC pada data uji hold-out." title="Fig"/>
             <wp:cNvGraphicFramePr>
               <a:graphicFrameLocks noChangeAspect="1"/>
             </wp:cNvGraphicFramePr>
@@ -5157,7 +5157,7 @@
           <w:color w:val="000000"/>
           <w:sz w:val="16"/>
         </w:rPr>
-        <w:t>Fig. 5. Kurva ROC pada hold-out test.</w:t>
+        <w:t>Fig. 5. Kurva ROC pada data uji hold-out.</w:t>
       </w:r>
     </w:p>
     <w:p>
@@ -5174,7 +5174,7 @@
           <w:color w:val="000000"/>
           <w:sz w:val="20"/>
         </w:rPr>
-        <w:t>Kontribusi fitur Random Forest memperlihatkan bahwa sinyal perilaku awal menjadi pembeda utama. Total klik VLE, hari aktivitas terakhir, jumlah hari aktif, dan ragam situs yang diakses muncul sebagai prediktor teratas, diikuti fitur assessment dan registrasi. Temuan ini selaras dengan tujuan early warning karena model banyak bertumpu pada jejak engagement yang sudah tersedia sampai akhir minggu keempat. Nilai importance tetap dibaca sebagai kontribusi prediktif, bukan bukti hubungan sebab akibat.</w:t>
+        <w:t>Kontribusi fitur Random Forest memperlihatkan bahwa sinyal perilaku awal menjadi pembeda utama. Total klik VLE, hari aktivitas terakhir, jumlah hari aktif, dan ragam situs yang diakses muncul sebagai prediktor teratas, diikuti fitur assessment dan registrasi. Temuan ini selaras dengan tujuan peringatan dini karena model banyak bertumpu pada jejak engagement yang sudah tersedia sampai akhir minggu keempat. Nilai importance tetap ditafsirkan sebagai kontribusi prediktif, bukan bukti hubungan sebab akibat.</w:t>
       </w:r>
     </w:p>
     <w:p>
@@ -5249,7 +5249,7 @@
           <w:color w:val="000000"/>
           <w:sz w:val="20"/>
         </w:rPr>
-        <w:t>D. Knowledge-Based Risk Layer</w:t>
+        <w:t>D. Rule-Based Risk Layer</w:t>
       </w:r>
     </w:p>
     <w:p>
@@ -5266,7 +5266,7 @@
           <w:color w:val="000000"/>
           <w:sz w:val="20"/>
         </w:rPr>
-        <w:t xml:space="preserve">Threshold kuartil bawah data train-validation adalah skor assessment 0, jumlah assessment 0, total klik VLE 47, dan hari aktif VLE 4. Nilai nol pada indikator assessment menunjukkan bahwa sebagian mahasiswa belum mengumpulkan assessment sampai akhir minggu keempat. Knowledge layer menghasilkan 1.795 </w:t>
+        <w:t xml:space="preserve">Ambang kuartil bawah data latih-validasi adalah skor assessment 0, jumlah assessment 0, total klik VLE 47, dan hari aktif VLE 4. Nilai nol pada indikator assessment menunjukkan bahwa sebagian mahasiswa belum mengumpulkan assessment sampai akhir minggu keempat. Lapisan risiko berbasis aturan menghasilkan 1.795 </w:t>
       </w:r>
       <w:r>
         <w:rPr>
@@ -5326,7 +5326,7 @@
           <w:color w:val="000000"/>
           <w:sz w:val="20"/>
         </w:rPr>
-        <w:t xml:space="preserve"> pada hold-out test.</w:t>
+        <w:t xml:space="preserve"> pada data uji hold-out.</w:t>
       </w:r>
     </w:p>
     <w:p>
@@ -5343,7 +5343,7 @@
           <w:color w:val="000000"/>
           <w:sz w:val="20"/>
         </w:rPr>
-        <w:t>Tabel III membandingkan Random Forest dengan sistem gabungan. Knowledge layer meningkatkan recall dari 0,7172 menjadi 0,7849. Precision berubah dari 0,8032 menjadi 0,7039, sedangkan accuracy berubah dari 0,7592 menjadi 0,7136. Perubahan tersebut menunjukkan perluasan cakupan deteksi disertai peningkatan jumlah alarm yang memerlukan verifikasi stakeholder.</w:t>
+        <w:t>Tabel III membandingkan Random Forest dengan sistem gabungan. Lapisan risiko berbasis aturan meningkatkan recall dari 0,7172 menjadi 0,7849. Precision berubah dari 0,8032 menjadi 0,7039, sedangkan accuracy berubah dari 0,7592 menjadi 0,7136. Perubahan tersebut menunjukkan perluasan cakupan deteksi disertai peningkatan jumlah alarm yang memerlukan verifikasi oleh pemangku kepentingan akademik.</w:t>
       </w:r>
     </w:p>
     <w:p>
@@ -5367,7 +5367,7 @@
           <w:color w:val="000000"/>
           <w:sz w:val="16"/>
         </w:rPr>
-        <w:t>PERBANDINGAN MODEL DAN KNOWLEDGE-BASED RISK LAYER</w:t>
+        <w:t>PERBANDINGAN MODEL DAN LAPISAN RISIKO BERBASIS ATURAN</w:t>
       </w:r>
     </w:p>
     <w:tbl>
@@ -5473,7 +5473,7 @@
                 <w:color w:val="000000"/>
                 <w:sz w:val="13"/>
               </w:rPr>
-              <w:t>RF + Knowledge Layer</w:t>
+              <w:t>RF + Lapisan Aturan</w:t>
             </w:r>
           </w:p>
         </w:tc>
@@ -5911,7 +5911,7 @@
           <w:color w:val="000000"/>
           <w:sz w:val="20"/>
         </w:rPr>
-        <w:t xml:space="preserve">. Sinyal paling dominan adalah skor assessment rendah dengan 2.341 kasus. Module GGG presentation 2014J memiliki proporsi prioritas tertinggi pada hold-out test, yaitu 100% kasus </w:t>
+        <w:t xml:space="preserve">. Sinyal paling dominan adalah skor assessment rendah dengan 2.341 kasus. Module GGG presentation 2014J memiliki proporsi prioritas tertinggi pada data uji hold-out, yaitu 100% kasus </w:t>
       </w:r>
       <w:r>
         <w:rPr>
@@ -5951,7 +5951,7 @@
           <w:color w:val="000000"/>
           <w:sz w:val="20"/>
         </w:rPr>
-        <w:t>. Indikator tersebut berfungsi sebagai sinyal untuk peninjauan konteks modul dan kapasitas intervensi.</w:t>
+        <w:t>. Indikator tersebut berfungsi sebagai sinyal untuk meninjau konteks modul dan kapasitas intervensi.</w:t>
       </w:r>
     </w:p>
     <w:p>
@@ -6005,7 +6005,7 @@
           <w:color w:val="000000"/>
           <w:sz w:val="20"/>
         </w:rPr>
-        <w:t>Keluaran analitik kemudian diterjemahkan ke dalam dashboard agar hasil model dapat dibaca sebagai prioritas tindakan, bukan hanya sebagai angka evaluasi. Tampilan tersebut menghubungkan KPI risiko, level prioritas, konsentrasi module-presentation, distribusi probabilitas, sinyal dominan, perbandingan perilaku, confusion matrix, dan trade-off setelah knowledge layer. Dengan susunan ini, pengguna dapat bergerak dari ringkasan strategis menuju penelusuran kelompok atau mahasiswa yang membutuhkan tindak lanjut.</w:t>
+        <w:t>Keluaran analitik kemudian disajikan ke dalam dashboard agar hasil model menjadi prioritas tindakan, bukan hanya angka evaluasi. Tampilan tersebut menghubungkan KPI risiko, level prioritas, konsentrasi module-presentation, distribusi probabilitas, sinyal dominan, perbandingan perilaku, confusion matrix, dan perubahan performa setelah lapisan risiko berbasis aturan. Dengan susunan ini, pengguna dapat bergerak dari ringkasan strategis menuju penelusuran kelompok atau mahasiswa yang membutuhkan tindak lanjut.</w:t>
       </w:r>
     </w:p>
     <w:p>
@@ -6029,7 +6029,7 @@
         <w:drawing>
           <wp:inline xmlns:a="http://schemas.openxmlformats.org/drawingml/2006/main" xmlns:pic="http://schemas.openxmlformats.org/drawingml/2006/picture">
             <wp:extent cx="5486400" cy="4940761"/>
-            <wp:docPr id="7" name="Picture 7" descr="Fig. 7. Dashboard early warning OULAD pada akhir minggu keempat." title="Fig"/>
+            <wp:docPr id="7" name="Picture 7" descr="Fig. 7. Dashboard peringatan dini OULAD pada akhir minggu keempat." title="Fig"/>
             <wp:cNvGraphicFramePr>
               <a:graphicFrameLocks noChangeAspect="1"/>
             </wp:cNvGraphicFramePr>
@@ -6074,7 +6074,7 @@
           <w:color w:val="000000"/>
           <w:sz w:val="16"/>
         </w:rPr>
-        <w:t>Fig. 7. Dashboard early warning OULAD pada akhir minggu keempat.</w:t>
+        <w:t>Fig. 7. Dashboard peringatan dini OULAD pada akhir minggu keempat.</w:t>
       </w:r>
     </w:p>
     <w:p>
@@ -6139,7 +6139,7 @@
           <w:color w:val="000000"/>
           <w:sz w:val="20"/>
         </w:rPr>
-        <w:t xml:space="preserve"> tertinggi pada cross-validation dan hold-out test. Penelitian ini memprioritaskan recall karena early warning diarahkan untuk memperluas cakupan mahasiswa berisiko yang dapat diverifikasi oleh stakeholder. F1-score Random Forest dan XGBoost pada hold-out test memiliki nilai sama sebesar 0,7578, sehingga recall menjadi pembeda yang relevan.</w:t>
+        <w:t xml:space="preserve"> tertinggi pada cross-validation dan data uji hold-out. Penelitian ini memprioritaskan recall karena sistem peringatan dini diarahkan untuk memperluas cakupan mahasiswa berisiko yang dapat diverifikasi oleh pemangku kepentingan akademik. F1-score Random Forest dan XGBoost pada data uji hold-out memiliki nilai sama sebesar 0,7578, sehingga recall menjadi pembeda yang relevan.</w:t>
       </w:r>
     </w:p>
     <w:p>
@@ -6156,7 +6156,7 @@
           <w:color w:val="000000"/>
           <w:sz w:val="20"/>
         </w:rPr>
-        <w:t>Performa sekitar 0,76 lebih rendah dibandingkan eksperimen yang memakai aktivitas seluruh semester dan status unregistration. Nilai tersebut merepresentasikan kondisi yang lebih menantang karena model hanya menerima informasi sampai hari ke-28. Pembatasan temporal menjaga hubungan antara waktu fitur tersedia dan waktu keputusan intervensi. Hasil ini memperlihatkan bahwa evaluasi early warning perlu dibaca berdasarkan horizon prediksi, sehingga perbandingan performa antarpenelitian memerlukan kesetaraan cut-off data.</w:t>
+        <w:t>Performa sekitar 0,76 lebih rendah dibandingkan eksperimen yang memakai aktivitas seluruh semester dan status unregistration. Nilai tersebut merepresentasikan kondisi yang lebih menantang karena model hanya menerima informasi sampai hari ke-28. Pembatasan temporal menjaga hubungan antara waktu fitur tersedia dan waktu keputusan intervensi. Hasil ini memperlihatkan bahwa evaluasi sistem peringatan dini perlu ditafsirkan berdasarkan horizon prediksi, sehingga perbandingan performa antarpenelitian memerlukan kesetaraan batas data.</w:t>
       </w:r>
     </w:p>
     <w:p>
@@ -6173,7 +6173,7 @@
           <w:color w:val="000000"/>
           <w:sz w:val="20"/>
         </w:rPr>
-        <w:t>Threshold assessment sebesar nol memiliki makna operasional khusus. Pada minggu keempat, sejumlah module-presentation belum menghasilkan submission assessment untuk semua mahasiswa. Kondisi belum mengumpulkan assessment menjadi sinyal engagement awal, sedangkan kemampuan membedakan skor rendah di atas nol masih terbatas. Penelitian lanjutan dapat menggunakan threshold per module-presentation atau menyesuaikan cut-off dengan jadwal assessment untuk memperoleh aturan yang lebih kontekstual.</w:t>
+        <w:t>Ambang assessment sebesar nol memiliki makna operasional khusus. Pada minggu keempat, sejumlah module-presentation belum menghasilkan submission assessment untuk semua mahasiswa. Kondisi belum mengumpulkan assessment menjadi sinyal engagement awal, sedangkan kemampuan membedakan skor rendah di atas nol masih terbatas. Penelitian lanjutan dapat menggunakan ambang per module-presentation atau menyesuaikan batas waktu dengan jadwal assessment untuk memperoleh aturan yang lebih kontekstual.</w:t>
       </w:r>
     </w:p>
     <w:p>
@@ -6190,7 +6190,7 @@
           <w:color w:val="000000"/>
           <w:sz w:val="20"/>
         </w:rPr>
-        <w:t xml:space="preserve">Knowledge-based risk layer meningkatkan recall sebesar 0,0677 poin dari 0,7172 menjadi 0,7849. Peningkatan tersebut memperluas cakupan mahasiswa </w:t>
+        <w:t xml:space="preserve">Lapisan risiko berbasis aturan meningkatkan recall sebesar 0,0677 poin dari 0,7172 menjadi 0,7849. Peningkatan tersebut memperluas cakupan mahasiswa </w:t>
       </w:r>
       <w:r>
         <w:rPr>
@@ -6210,7 +6210,7 @@
           <w:color w:val="000000"/>
           <w:sz w:val="20"/>
         </w:rPr>
-        <w:t xml:space="preserve"> yang masuk antrean intervensi. Penurunan precision menjadi 0,7039 menunjukkan bertambahnya kasus yang perlu diverifikasi. Trade-off ini berkaitan langsung dengan kapasitas operasional. Institusi dengan sumber daya konseling terbatas dapat memprioritaskan </w:t>
+        <w:t xml:space="preserve"> yang masuk antrean intervensi. Penurunan precision menjadi 0,7039 menunjukkan bertambahnya kasus yang perlu diverifikasi. Perubahan ini berkaitan langsung dengan kapasitas operasional. Institusi dengan sumber daya konseling terbatas dapat memprioritaskan </w:t>
       </w:r>
       <w:r>
         <w:rPr>
@@ -6267,7 +6267,7 @@
           <w:color w:val="000000"/>
           <w:sz w:val="20"/>
         </w:rPr>
-        <w:t>Knowledge layer juga meningkatkan interpretabilitas praktis. Probabilitas model dilengkapi dengan alasan seperti aktivitas VLE rendah, hari aktif rendah, atau assessment yang belum dikerjakan. Informasi tersebut membantu memilih bentuk intervensi yang sesuai. Hubungan ini bersifat asosiasi prediktif, sehingga rekomendasi tetap memerlukan validasi manusia dan informasi kontekstual dari dosen atau tutor.</w:t>
+        <w:t>Lapisan berbasis aturan juga meningkatkan interpretabilitas praktis. Probabilitas model dilengkapi dengan alasan seperti aktivitas VLE rendah, hari aktif rendah, atau assessment yang belum dikerjakan. Informasi tersebut membantu memilih bentuk intervensi yang sesuai. Hubungan ini bersifat asosiasi prediktif, sehingga rekomendasi tetap memerlukan validasi manusia dan informasi kontekstual dari dosen atau tutor.</w:t>
       </w:r>
     </w:p>
     <w:p>
@@ -6284,7 +6284,7 @@
           <w:color w:val="000000"/>
           <w:sz w:val="20"/>
         </w:rPr>
-        <w:t>Dashboard memperluas fungsi eksperimen dari evaluasi teknis menjadi Business Intelligence. Agregasi per module-presentation membantu program studi mengenali konsentrasi risiko, sedangkan daftar prioritas mendukung tindak lanjut tingkat mahasiswa. Temuan 100% prioritas pada GGG 2014J perlu dibaca bersama ukuran kelompok, jadwal assessment, dan karakteristik modul. Dashboard menyediakan titik awal investigasi dan monitoring, sedangkan keputusan akademik ditetapkan melalui proses institusional.</w:t>
+        <w:t>Dashboard memperluas fungsi eksperimen dari evaluasi teknis menjadi Business Intelligence. Agregasi per module-presentation membantu program studi mengenali konsentrasi risiko, sedangkan daftar prioritas mendukung tindak lanjut tingkat mahasiswa. Temuan 100% prioritas pada GGG 2014J perlu ditafsirkan bersama ukuran kelompok, jadwal assessment, dan karakteristik modul. Dashboard menyediakan titik awal investigasi dan monitoring, sedangkan keputusan akademik ditetapkan melalui proses institusional.</w:t>
       </w:r>
     </w:p>
     <w:p>
@@ -6301,7 +6301,7 @@
           <w:color w:val="000000"/>
           <w:sz w:val="20"/>
         </w:rPr>
-        <w:t>Penelitian memiliki beberapa keterbatasan. OULAD berasal dari konteks Open University di Inggris sehingga validitas eksternal pada institusi lain memerlukan pengujian ulang. Fitur perilaku dibatasi pada agregasi sampai hari ke-28 dan belum memodelkan urutan temporal harian. Hyperparameter model menggunakan konfigurasi baseline. Threshold berbasis kuartil memerlukan validasi pakar dan dapat berubah mengikuti cohort, module-presentation, atau kebijakan akademik. Evaluasi juga mengukur performa deteksi, sedangkan dampak intervensi terhadap retensi memerlukan desain eksperimen lanjutan.</w:t>
+        <w:t>Penelitian memiliki beberapa keterbatasan. OULAD berasal dari konteks Open University di Inggris sehingga validitas eksternal pada institusi lain memerlukan pengujian ulang. Fitur perilaku dibatasi pada agregasi sampai hari ke-28 dan belum memodelkan urutan temporal harian. Hyperparameter model menggunakan konfigurasi awal. Ambang berbasis kuartil memerlukan validasi pakar dan dapat berubah mengikuti cohort, module-presentation, atau kebijakan akademik. Evaluasi juga mengukur performa deteksi, sedangkan dampak intervensi terhadap retensi memerlukan desain eksperimen lanjutan.</w:t>
       </w:r>
     </w:p>
     <w:p>
@@ -6335,7 +6335,7 @@
           <w:color w:val="000000"/>
           <w:sz w:val="20"/>
         </w:rPr>
-        <w:t xml:space="preserve">Penelitian ini mengembangkan early warning risiko dropout mahasiswa pada akhir minggu keempat menggunakan OULAD. Dataset dibentuk pada unit student-module-presentation dengan fitur demografis, registrasi awal, assessment, dan aktivitas VLE sampai hari ke-28. Pemisahan berbasis </w:t>
+        <w:t xml:space="preserve">Penelitian ini mengembangkan sistem peringatan dini risiko dropout mahasiswa pada akhir minggu keempat menggunakan OULAD. Dataset dibentuk pada unit student-module-presentation dengan fitur demografis, registrasi awal, assessment, dan aktivitas VLE sampai hari ke-28. Pemisahan berbasis </w:t>
       </w:r>
       <w:r>
         <w:rPr>
@@ -6355,7 +6355,7 @@
           <w:color w:val="000000"/>
           <w:sz w:val="20"/>
         </w:rPr>
-        <w:t xml:space="preserve"> menjaga independensi mahasiswa antara train-validation dan hold-out test.</w:t>
+        <w:t xml:space="preserve"> menjaga independensi mahasiswa antara data latih-validasi dan data uji hold-out.</w:t>
       </w:r>
     </w:p>
     <w:p>
@@ -6392,7 +6392,7 @@
           <w:color w:val="000000"/>
           <w:sz w:val="20"/>
         </w:rPr>
-        <w:t xml:space="preserve"> cross-validation tertinggi sebesar 0,7126. Pada hold-out test, model menghasilkan accuracy 0,7592, precision 0,8032, recall 0,7172, F1-score 0,7578, dan ROC-AUC 0,8396. Knowledge-based risk layer meningkatkan recall menjadi 0,7849 dengan menggabungkan prediksi model dan empat sinyal perilaku awal. Sistem menghasilkan level risiko, alasan, dan rekomendasi yang dapat diterjemahkan menjadi antrean intervensi.</w:t>
+        <w:t xml:space="preserve"> cross-validation tertinggi sebesar 0,7126. Pada data uji hold-out, model menghasilkan accuracy 0,7592, precision 0,8032, recall 0,7172, F1-score 0,7578, dan ROC-AUC 0,8396. Lapisan risiko berbasis aturan meningkatkan recall menjadi 0,7849 dengan menggabungkan prediksi model dan empat sinyal perilaku awal. Sistem menghasilkan level risiko, alasan, dan rekomendasi yang dapat disusun menjadi antrean intervensi.</w:t>
       </w:r>
     </w:p>
     <w:p>
@@ -6409,7 +6409,7 @@
           <w:color w:val="000000"/>
           <w:sz w:val="20"/>
         </w:rPr>
-        <w:t>Dashboard Business Intelligence menyajikan distribusi risiko, prioritas module-presentation, sinyal dominan, performa model, dan daftar mahasiswa anonim untuk monitoring. Integrasi supervised learning, knowledge-based risk layer, dan visual analytics menghasilkan decision support yang menghubungkan prediksi dengan proses tindak lanjut akademik.</w:t>
+        <w:t>Dashboard Business Intelligence menyajikan distribusi risiko, prioritas module-presentation, sinyal dominan, performa model, dan daftar mahasiswa anonim untuk monitoring. Integrasi supervised learning, lapisan risiko berbasis aturan, dan visual analytics menghasilkan dasar pendukung keputusan yang menghubungkan prediksi dengan proses tindak lanjut akademik.</w:t>
       </w:r>
     </w:p>
     <w:p>
@@ -6426,7 +6426,7 @@
           <w:color w:val="000000"/>
           <w:sz w:val="20"/>
         </w:rPr>
-        <w:t>Pengembangan berikutnya dapat membandingkan horizon minggu keempat, kedelapan, dan kedua belas; menggunakan threshold per module-presentation; melakukan tuning hyperparameter; serta menguji validitas eksternal pada data institusi lain. Evaluasi dampak intervensi juga diperlukan untuk mengukur kontribusi sistem terhadap keberlanjutan studi mahasiswa.</w:t>
+        <w:t>Pengembangan berikutnya dapat membandingkan horizon minggu keempat, kedelapan, dan kedua belas; menggunakan ambang per module-presentation; melakukan tuning hyperparameter; serta menguji validitas eksternal pada data institusi lain. Evaluasi dampak intervensi juga diperlukan untuk mengukur kontribusi sistem terhadap keberlanjutan studi mahasiswa.</w:t>
       </w:r>
     </w:p>
     <w:p>

</xml_diff>

<commit_message>
Revert "docs: polish IEEE article language"
This reverts commit 683d649f61a0cb561963a0670ddf0ab04ce44984.
</commit_message>
<xml_diff>
--- a/docs/artikel-ieee/Artikel IEEE - 24.55.2714 - Muhammad Rizky Hajar.docx
+++ b/docs/artikel-ieee/Artikel IEEE - 24.55.2714 - Muhammad Rizky Hajar.docx
@@ -419,7 +419,7 @@
           <w:color w:val="000000"/>
           <w:sz w:val="18"/>
         </w:rPr>
-        <w:t xml:space="preserve">Dropout mahasiswa memengaruhi keberlanjutan studi, efektivitas layanan akademik, dan pengambilan keputusan institusional. Penelitian ini mengembangkan sistem peringatan dini risiko dropout mahasiswa pada akhir minggu keempat menggunakan Open University Learning Analytics Dataset (OULAD). Target dirumuskan sebagai klasifikasi biner, yaitu </w:t>
+        <w:t xml:space="preserve">Dropout mahasiswa memengaruhi keberlanjutan studi, efektivitas layanan akademik, dan pengambilan keputusan institusional. Penelitian ini mengembangkan early warning risiko dropout mahasiswa pada akhir minggu keempat menggunakan Open University Learning Analytics Dataset (OULAD). Target dirumuskan sebagai klasifikasi biner, yaitu </w:t>
       </w:r>
       <w:r>
         <w:rPr>
@@ -539,7 +539,7 @@
           <w:color w:val="000000"/>
           <w:sz w:val="18"/>
         </w:rPr>
-        <w:t xml:space="preserve">. Fitur prediktor dibentuk dari data demografis, registrasi awal, assessment, dan aktivitas Virtual Learning Environment yang tersedia sampai hari ke-28. Evaluasi membandingkan Logistic Regression, Random Forest, dan XGBoost melalui pengujian hold-out berbasis kelompok mahasiswa dan 5-fold GroupKFold. Random Forest dipilih berdasarkan recall </w:t>
+        <w:t xml:space="preserve">. Fitur prediktor dibentuk dari data demografis, registrasi awal, assessment, dan aktivitas Virtual Learning Environment yang tersedia sampai hari ke-28. Evaluasi membandingkan Logistic Regression, Random Forest, dan XGBoost melalui hold-out test berbasis kelompok mahasiswa dan 5-fold GroupKFold. Random Forest dipilih berdasarkan recall </w:t>
       </w:r>
       <w:r>
         <w:rPr>
@@ -559,7 +559,7 @@
           <w:color w:val="000000"/>
           <w:sz w:val="18"/>
         </w:rPr>
-        <w:t xml:space="preserve"> cross-validation tertinggi sebesar 0,7126. Pada data uji hold-out, model tersebut menghasilkan accuracy 0,7592, precision 0,8032, recall 0,7172, F1-score 0,7578, dan ROC-AUC 0,8396. Lapisan risiko berbasis aturan menggabungkan prediksi model dengan empat indikator perilaku awal untuk menghasilkan level </w:t>
+        <w:t xml:space="preserve"> cross-validation tertinggi sebesar 0,7126. Pada hold-out test, model tersebut menghasilkan accuracy 0,7592, precision 0,8032, recall 0,7172, F1-score 0,7578, dan ROC-AUC 0,8396. Knowledge-based risk layer menggabungkan prediksi model dengan empat indikator perilaku awal untuk menghasilkan level </w:t>
       </w:r>
       <w:r>
         <w:rPr>
@@ -619,7 +619,7 @@
           <w:color w:val="000000"/>
           <w:sz w:val="18"/>
         </w:rPr>
-        <w:t xml:space="preserve"> beserta alasan dan rekomendasi intervensi. Sistem gabungan meningkatkan recall menjadi 0,7849 dengan precision 0,7039. Hasil analitik disajikan melalui dashboard statis yang memuat indikator risiko, prioritas module-presentation, sinyal dominan, dan daftar mahasiswa untuk mendukung monitoring akademik. Pendekatan ini menghubungkan prediksi, interpretasi berbasis aturan, dan visualisasi pendukung keputusan untuk intervensi dini.</w:t>
+        <w:t xml:space="preserve"> beserta alasan dan rekomendasi intervensi. Sistem gabungan meningkatkan recall menjadi 0,7849 dengan precision 0,7039. Hasil analitik disajikan melalui dashboard statis yang memuat indikator risiko, prioritas module-presentation, sinyal dominan, dan daftar mahasiswa untuk mendukung monitoring akademik. Pendekatan ini menyediakan integrasi prediksi, interpretasi berbasis aturan, dan visual decision support untuk intervensi dini.</w:t>
       </w:r>
     </w:p>
     <w:p>
@@ -679,7 +679,7 @@
           <w:color w:val="000000"/>
           <w:sz w:val="20"/>
         </w:rPr>
-        <w:t>Dropout mahasiswa menjadi isu penting dalam pendidikan tinggi karena berkaitan dengan keberlanjutan studi, kualitas layanan akademik, dan efektivitas pengambilan keputusan institusional. Penelitian sebelumnya menunjukkan bahwa machine learning dapat memprediksi retensi mahasiswa menggunakan karakteristik sosiodemografis dan metrik engagement [1]. Sistem peringatan dini memperluas manfaat prediksi dengan menempatkan identifikasi risiko pada periode ketika intervensi akademik masih dapat dilakukan [2]. Ketersediaan informasi risiko pada minggu-minggu awal memberi ruang bagi dosen, tutor, dan pengelola program studi untuk merancang tindak lanjut yang relevan.</w:t>
+        <w:t>Dropout mahasiswa menjadi isu penting dalam pendidikan tinggi karena berkaitan dengan keberlanjutan studi, kualitas layanan akademik, dan efektivitas pengambilan keputusan institusional. Penelitian sebelumnya menunjukkan bahwa machine learning dapat memprediksi retensi mahasiswa menggunakan karakteristik sosiodemografis dan metrik engagement [1]. Early warning system memperluas manfaat prediksi dengan menempatkan identifikasi risiko pada periode ketika intervensi akademik masih dapat dilakukan [2]. Ketersediaan informasi risiko pada minggu-minggu awal memberi ruang bagi dosen, tutor, dan pengelola program studi untuk merancang tindak lanjut yang relevan.</w:t>
       </w:r>
     </w:p>
     <w:p>
@@ -696,7 +696,7 @@
           <w:color w:val="000000"/>
           <w:sz w:val="20"/>
         </w:rPr>
-        <w:t>Sistem pembelajaran digital menghasilkan data akademik dan jejak aktivitas yang dapat digunakan untuk memahami engagement mahasiswa. Data tersebut mencakup interaksi dengan Virtual Learning Environment (VLE), partisipasi assessment, performa penilaian, dan informasi registrasi awal. Studi mengenai jejak digital memperlihatkan bahwa pola aktivitas Learning Management System dapat membantu menjelaskan variasi performa dan risiko mahasiswa [3]. Open University Learning Analytics Dataset (OULAD) menyediakan data tersebut dalam struktur relasional yang mencakup profil mahasiswa, assessment, registrasi, dan lebih dari sepuluh juta catatan aktivitas VLE [4].</w:t>
+        <w:t>Sistem pembelajaran digital menghasilkan data akademik dan jejak aktivitas yang dapat digunakan untuk membaca engagement mahasiswa. Data tersebut mencakup interaksi dengan Virtual Learning Environment (VLE), partisipasi assessment, performa penilaian, dan informasi registrasi awal. Studi mengenai digital traces memperlihatkan bahwa pola aktivitas Learning Management System dapat membantu memahami variasi performa dan risiko mahasiswa [3]. Open University Learning Analytics Dataset (OULAD) menyediakan data tersebut dalam struktur relasional yang mencakup profil mahasiswa, assessment, registrasi, dan lebih dari sepuluh juta catatan aktivitas VLE [4].</w:t>
       </w:r>
     </w:p>
     <w:p>
@@ -713,7 +713,7 @@
           <w:color w:val="000000"/>
           <w:sz w:val="20"/>
         </w:rPr>
-        <w:t>Nilai prediktif suatu model bergantung pada kesesuaian data dengan waktu keputusan. Penggunaan aktivitas seluruh semester atau status unregistration menghasilkan informasi yang kuat untuk klasifikasi retrospektif, sedangkan sistem peringatan dini memerlukan fitur yang telah tersedia pada waktu prediksi. Penelitian ini menggunakan batas hari ke-28 untuk merepresentasikan akhir minggu keempat. Assessment dan aktivitas VLE setelah batas tersebut dikeluarkan dari fitur, sedangkan status unregistration diperlakukan sebagai informasi masa depan. Pembatasan temporal tersebut menghasilkan estimasi performa yang lebih dekat dengan kondisi intervensi dini.</w:t>
+        <w:t>Nilai prediktif suatu model bergantung pada kesesuaian data dengan waktu keputusan. Penggunaan aktivitas seluruh semester atau status unregistration menghasilkan informasi yang kuat untuk klasifikasi retrospektif, sedangkan early warning memerlukan fitur yang telah tersedia pada waktu prediksi. Penelitian ini menggunakan cut-off hari ke-28 untuk merepresentasikan akhir minggu keempat. Assessment dan aktivitas VLE setelah cut-off dikeluarkan dari fitur, sedangkan status unregistration diperlakukan sebagai informasi masa depan. Pembatasan temporal tersebut menghasilkan estimasi performa yang lebih dekat dengan kondisi intervensi dini.</w:t>
       </w:r>
     </w:p>
     <w:p>
@@ -730,7 +730,7 @@
           <w:color w:val="000000"/>
           <w:sz w:val="20"/>
         </w:rPr>
-        <w:t>Literatur menunjukkan bahwa kemampuan mendeteksi mahasiswa berisiko perlu dihubungkan dengan proses tindak lanjut agar memberi dampak institusional [2]. Model machine learning menghasilkan kelas dan probabilitas, sedangkan pemangku kepentingan memerlukan alasan risiko, prioritas, dan rekomendasi yang dapat digunakan dalam kerja operasional. Kebutuhan tersebut membentuk celah penelitian pada integrasi antara evaluasi model, interpretasi berbasis aturan, dan penyajian visual untuk mendukung keputusan.</w:t>
+        <w:t>Literatur menunjukkan bahwa kemampuan mendeteksi mahasiswa berisiko perlu dihubungkan dengan proses tindak lanjut agar memberi dampak institusional [2]. Model machine learning menghasilkan kelas dan probabilitas, sedangkan pemangku kepentingan memerlukan alasan risiko, prioritas, dan rekomendasi yang dapat dibaca secara operasional. Kebutuhan tersebut membentuk research gap pada integrasi antara evaluasi model, interpretasi berbasis aturan, dan penyajian visual untuk decision support.</w:t>
       </w:r>
     </w:p>
     <w:p>
@@ -747,7 +747,7 @@
           <w:color w:val="000000"/>
           <w:sz w:val="20"/>
         </w:rPr>
-        <w:t>Penelitian ini bertujuan mengembangkan klasifikasi biner risiko dropout mahasiswa pada minggu keempat, mengevaluasi tiga algoritma supervised learning, dan mengintegrasikan model terpilih dengan lapisan risiko berbasis aturan. Hasil sistem disajikan dalam dashboard Business Intelligence untuk monitoring risiko dan prioritas intervensi akademik.</w:t>
+        <w:t>Penelitian ini bertujuan mengembangkan klasifikasi biner risiko dropout mahasiswa pada minggu keempat, mengevaluasi tiga algoritma supervised learning, dan mengintegrasikan model terpilih dengan knowledge-based risk layer. Hasil sistem diterjemahkan menjadi dashboard Business Intelligence untuk monitoring risiko dan prioritas intervensi akademik.</w:t>
       </w:r>
     </w:p>
     <w:p>
@@ -764,7 +764,7 @@
           <w:color w:val="000000"/>
           <w:sz w:val="20"/>
         </w:rPr>
-        <w:t xml:space="preserve">Kontribusi penelitian terdiri atas empat bagian. Pertama, penelitian membentuk dataset peringatan dini pada unit student-module-presentation dengan batas hari ke-28. Kedua, evaluasi menggunakan pemisahan berbasis </w:t>
+        <w:t xml:space="preserve">Kontribusi penelitian terdiri atas empat bagian. Pertama, penelitian membentuk dataset early warning pada unit student-module-presentation dengan cut-off hari ke-28. Kedua, evaluasi menggunakan pemisahan berbasis </w:t>
       </w:r>
       <w:r>
         <w:rPr>
@@ -784,7 +784,7 @@
           <w:color w:val="000000"/>
           <w:sz w:val="20"/>
         </w:rPr>
-        <w:t xml:space="preserve"> untuk menjaga independensi mahasiswa antara data pelatihan dan pengujian. Ketiga, lapisan risiko berbasis aturan menghasilkan level, alasan risiko, dan rekomendasi berdasarkan prediksi model serta perilaku awal. Keempat, dashboard mengubah keluaran analitik menjadi indikator yang mendukung keputusan pimpinan akademik, program studi, tutor, dosen wali, dan tim konseling.</w:t>
+        <w:t xml:space="preserve"> untuk menjaga independensi mahasiswa antara data pelatihan dan pengujian. Ketiga, knowledge-based risk layer menghasilkan level, alasan risiko, dan rekomendasi berdasarkan prediksi model serta perilaku awal. Keempat, dashboard mengubah keluaran analitik menjadi indikator yang mendukung keputusan pimpinan akademik, program studi, tutor, dosen wali, dan tim konseling.</w:t>
       </w:r>
     </w:p>
     <w:p>
@@ -835,7 +835,7 @@
           <w:color w:val="000000"/>
           <w:sz w:val="20"/>
         </w:rPr>
-        <w:t>Sistem peringatan dini mengarahkan hasil prediksi pada proses intervensi. Plak et al. menunjukkan bahwa informasi risiko perlu disertai rancangan tindak lanjut agar dapat memengaruhi hasil akademik [2]. Temuan tersebut menegaskan peran proses bisnis, kapasitas intervensi, dan komunikasi informasi kepada konselor atau pengelola akademik. Model dengan recall tinggi memberi cakupan deteksi yang luas, sedangkan precision menentukan proporsi alarm yang relevan untuk ditindaklanjuti.</w:t>
+        <w:t>Early warning system mengarahkan hasil prediksi pada proses intervensi. Plak et al. menunjukkan bahwa informasi risiko perlu disertai rancangan tindak lanjut agar dapat memengaruhi hasil akademik [2]. Temuan tersebut menegaskan peran proses bisnis, kapasitas intervensi, dan komunikasi informasi kepada konselor atau pengelola akademik. Model dengan recall tinggi memberi cakupan deteksi yang luas, sedangkan precision menentukan proporsi alarm yang relevan untuk ditindaklanjuti.</w:t>
       </w:r>
     </w:p>
     <w:p>
@@ -852,7 +852,7 @@
           <w:color w:val="000000"/>
           <w:sz w:val="20"/>
         </w:rPr>
-        <w:t>Aktivitas Learning Management System atau VLE banyak digunakan sebagai sumber fitur karena merepresentasikan pola engagement mahasiswa. Data klik, frekuensi aktivitas, hari aktif, jenis materi, dan pola interaksi dapat mendukung analisis performa akademik [3]. XGBoost telah digunakan untuk peringatan dini berbasis data pra-enrollment [6], AutoML mendukung eksplorasi educational analytics [7], dan statistical learning serta deep learning digunakan pada precision education [8]. Random Forest juga sesuai untuk data tabular yang memuat kombinasi fitur akademik dan sosiodemografis [9].</w:t>
+        <w:t>Aktivitas Learning Management System atau VLE banyak digunakan sebagai sumber fitur karena merepresentasikan pola engagement mahasiswa. Data klik, frekuensi aktivitas, hari aktif, jenis materi, dan pola interaksi dapat mendukung analisis performa akademik [3]. XGBoost telah digunakan untuk early warning berbasis data pra-enrollment [6], AutoML mendukung eksplorasi educational analytics [7], dan statistical learning serta deep learning digunakan pada precision education [8]. Random Forest juga sesuai untuk data tabular yang memuat kombinasi fitur akademik dan sosiodemografis [9].</w:t>
       </w:r>
     </w:p>
     <w:p>
@@ -886,7 +886,7 @@
           <w:color w:val="000000"/>
           <w:sz w:val="20"/>
         </w:rPr>
-        <w:t>Penelitian ini mengambil posisi pada integrasi tiga komponen. Supervised learning digunakan untuk menghasilkan probabilitas risiko, lapisan risiko berbasis aturan menerjemahkan probabilitas dan sinyal perilaku menjadi alasan serta level prioritas, dan dashboard menyajikan hasil sebagai dasar pendukung keputusan. Batas minggu keempat menjaga kesesuaian temporal antara fitur dan waktu intervensi. Integrasi tersebut menghubungkan evaluasi teknis dengan kebutuhan monitoring akademik yang dapat ditindaklanjuti.</w:t>
+        <w:t>Penelitian ini mengambil posisi pada integrasi tiga komponen. Supervised learning digunakan untuk menghasilkan probabilitas risiko, knowledge-based risk layer menerjemahkan probabilitas dan sinyal perilaku menjadi alasan serta level prioritas, dan dashboard menyajikan hasil sebagai visual decision support. Cut-off minggu keempat menjaga kesesuaian temporal antara fitur dan waktu intervensi. Integrasi tersebut menghubungkan evaluasi teknis dengan kebutuhan monitoring akademik yang dapat ditindaklanjuti.</w:t>
       </w:r>
     </w:p>
     <w:p>
@@ -937,7 +937,7 @@
           <w:color w:val="000000"/>
           <w:sz w:val="20"/>
         </w:rPr>
-        <w:t xml:space="preserve">Penelitian menggunakan desain supervised binary classification untuk mendeteksi risiko dropout pada akhir minggu keempat. Alur penelitian meliputi pengambilan dan audit OULAD, pembentukan fitur dengan batas temporal, exploratory data analysis, pemisahan data berbasis mahasiswa, pelatihan dan evaluasi model, pembentukan lapisan risiko berbasis aturan, serta penyajian indikator melalui dashboard Business Intelligence. Seluruh eksperimen menggunakan </w:t>
+        <w:t xml:space="preserve">Penelitian menggunakan desain supervised binary classification untuk mendeteksi risiko dropout pada akhir minggu keempat. Alur penelitian meliputi pengambilan dan audit OULAD, pembentukan fitur dengan cut-off temporal, exploratory data analysis, pemisahan data berbasis mahasiswa, pelatihan dan evaluasi model, pembentukan knowledge-based risk layer, serta penyajian indikator melalui dashboard Business Intelligence. Seluruh eksperimen menggunakan </w:t>
       </w:r>
       <w:r>
         <w:rPr>
@@ -1228,7 +1228,7 @@
           <w:color w:val="000000"/>
           <w:sz w:val="20"/>
         </w:rPr>
-        <w:t xml:space="preserve">. Satu baris data hasil olahan merepresentasikan satu student-module-presentation. Struktur ini mengikuti unit label pada </w:t>
+        <w:t xml:space="preserve">. Satu baris hasil preprocessing merepresentasikan satu student-module-presentation. Struktur ini mengikuti unit label pada </w:t>
       </w:r>
       <w:r>
         <w:rPr>
@@ -1265,7 +1265,7 @@
           <w:color w:val="000000"/>
           <w:sz w:val="20"/>
         </w:rPr>
-        <w:t>C. Target Label and Temporal Boundary</w:t>
+        <w:t>C. Target Label and Temporal Cut-off</w:t>
       </w:r>
     </w:p>
     <w:p>
@@ -1499,7 +1499,7 @@
           <w:color w:val="000000"/>
           <w:sz w:val="20"/>
         </w:rPr>
-        <w:t xml:space="preserve">Horizon peringatan dini ditetapkan pada hari ke-28. Submission assessment dipilih dengan kondisi </w:t>
+        <w:t xml:space="preserve">Horizon early warning ditetapkan pada hari ke-28. Submission assessment dipilih dengan kondisi </w:t>
       </w:r>
       <w:r>
         <w:rPr>
@@ -2127,7 +2127,7 @@
           <w:color w:val="000000"/>
           <w:sz w:val="20"/>
         </w:rPr>
-        <w:t>; nilai yang tidak dapat dikonversi diperlakukan sebagai data hilang. Agregat perilaku yang belum memiliki aktivitas diisi dengan nol. Dalam alur pemodelan, data hilang pada fitur numerik diimputasi menggunakan median dan kemudian distandardisasi. Data hilang pada fitur kategorikal diimputasi menggunakan modus dan ditransformasikan dengan one-hot encoding. Seluruh transformasi dipelajari hanya dari data pelatihan.</w:t>
+        <w:t xml:space="preserve"> dengan nilai yang tidak dapat dikonversi diperlakukan sebagai missing value. Agregat perilaku yang belum memiliki aktivitas diisi dengan nol. Pada pipeline model, missing value numerik diimputasi menggunakan median dan kemudian distandardisasi. Missing value kategorikal diimputasi menggunakan modus dan ditransformasikan dengan one-hot encoding. Seluruh transformasi dipelajari di dalam pipeline pada data pelatihan.</w:t>
       </w:r>
     </w:p>
     <w:p>
@@ -2161,7 +2161,7 @@
           <w:color w:val="000000"/>
           <w:sz w:val="20"/>
         </w:rPr>
-        <w:t xml:space="preserve">Data dibagi menjadi 80% data latih-validasi dan 20% data uji hold-out menggunakan </w:t>
+        <w:t xml:space="preserve">Data dibagi menjadi 80% train-validation dan 20% hold-out test menggunakan </w:t>
       </w:r>
       <w:r>
         <w:rPr>
@@ -2201,7 +2201,7 @@
           <w:color w:val="000000"/>
           <w:sz w:val="20"/>
         </w:rPr>
-        <w:t xml:space="preserve"> digunakan sebagai grup sehingga setiap mahasiswa ditempatkan secara eksklusif pada salah satu bagian. Data latih-validasi terdiri atas 26.122 baris dan data uji terdiri atas 6.471 baris. Pemeriksaan menunjukkan tidak ada mahasiswa yang muncul di kedua bagian.</w:t>
+        <w:t xml:space="preserve"> digunakan sebagai grup sehingga setiap mahasiswa ditempatkan secara eksklusif pada salah satu bagian. Train-validation terdiri atas 26.122 baris dan test terdiri atas 6.471 baris. Pemeriksaan menunjukkan overlap mahasiswa sebesar nol.</w:t>
       </w:r>
     </w:p>
     <w:p>
@@ -2238,7 +2238,7 @@
           <w:color w:val="000000"/>
           <w:sz w:val="20"/>
         </w:rPr>
-        <w:t xml:space="preserve"> pada data latih-validasi. Pemilihan model didasarkan pada rata-rata recall kelas </w:t>
+        <w:t xml:space="preserve"> pada train-validation. Pemilihan model didasarkan pada rata-rata recall kelas </w:t>
       </w:r>
       <w:r>
         <w:rPr>
@@ -2278,7 +2278,7 @@
           <w:color w:val="000000"/>
           <w:sz w:val="20"/>
         </w:rPr>
-        <w:t xml:space="preserve"> digunakan sebagai penentu ketika nilai recall berdekatan. Setelah model terpilih, performa akhir dilaporkan pada data uji hold-out.</w:t>
+        <w:t xml:space="preserve"> digunakan sebagai tie-breaker. Setelah model terpilih, performa akhir dilaporkan pada hold-out test.</w:t>
       </w:r>
     </w:p>
     <w:p>
@@ -2312,7 +2312,7 @@
           <w:color w:val="000000"/>
           <w:sz w:val="20"/>
         </w:rPr>
-        <w:t xml:space="preserve">Tiga algoritma dibandingkan. Logistic Regression digunakan sebagai pembanding linear dengan </w:t>
+        <w:t xml:space="preserve">Tiga algoritma dibandingkan. Logistic Regression digunakan sebagai baseline linear dengan </w:t>
       </w:r>
       <w:r>
         <w:rPr>
@@ -2372,7 +2372,7 @@
           <w:color w:val="000000"/>
           <w:sz w:val="20"/>
         </w:rPr>
-        <w:t xml:space="preserve"> dihitung dari distribusi kelas pada data latih-validasi.</w:t>
+        <w:t xml:space="preserve"> dihitung dari distribusi kelas train-validation.</w:t>
       </w:r>
     </w:p>
     <w:p>
@@ -2409,7 +2409,7 @@
           <w:color w:val="000000"/>
           <w:sz w:val="20"/>
         </w:rPr>
-        <w:t xml:space="preserve">, ROC-AUC, confusion matrix, serta ringkasan klasifikasi. Recall </w:t>
+        <w:t xml:space="preserve">, ROC-AUC, confusion matrix, serta classification report. Recall </w:t>
       </w:r>
       <w:r>
         <w:rPr>
@@ -2429,7 +2429,7 @@
           <w:color w:val="000000"/>
           <w:sz w:val="20"/>
         </w:rPr>
-        <w:t xml:space="preserve"> menjadi kriteria utama karena sistem peringatan dini memprioritaskan cakupan mahasiswa berisiko yang dapat diarahkan pada proses verifikasi dan intervensi.</w:t>
+        <w:t xml:space="preserve"> menjadi kriteria utama karena early warning memprioritaskan cakupan mahasiswa berisiko yang dapat diarahkan pada proses verifikasi dan intervensi.</w:t>
       </w:r>
     </w:p>
     <w:p>
@@ -2446,7 +2446,7 @@
           <w:color w:val="000000"/>
           <w:sz w:val="20"/>
         </w:rPr>
-        <w:t>G. Rule-Based Risk Layer</w:t>
+        <w:t>G. Knowledge-Based Risk Layer</w:t>
       </w:r>
     </w:p>
     <w:p>
@@ -2463,7 +2463,7 @@
           <w:color w:val="000000"/>
           <w:sz w:val="20"/>
         </w:rPr>
-        <w:t xml:space="preserve">Lapisan risiko berbasis aturan menggunakan empat indikator: </w:t>
+        <w:t xml:space="preserve">Knowledge-based risk layer menggunakan empat indikator: </w:t>
       </w:r>
       <w:r>
         <w:rPr>
@@ -2543,7 +2543,7 @@
           <w:color w:val="000000"/>
           <w:sz w:val="20"/>
         </w:rPr>
-        <w:t>. Ambang batas dihitung dari kuartil bawah data latih-validasi. Prosedur ini menjaga ambang batas tetap independen dari data uji hold-out. Hasil perhitungan menghasilkan ambang batas skor assessment 0, jumlah assessment 0, total klik VLE 47, dan hari aktif VLE 4.</w:t>
+        <w:t>. Threshold dihitung dari kuartil bawah data train-validation. Prosedur ini menjaga threshold tetap independen dari hold-out test. Hasil perhitungan menghasilkan threshold skor assessment 0, jumlah assessment 0, total klik VLE 47, dan hari aktif VLE 4.</w:t>
       </w:r>
     </w:p>
     <w:p>
@@ -2560,7 +2560,7 @@
           <w:color w:val="000000"/>
           <w:sz w:val="20"/>
         </w:rPr>
-        <w:t xml:space="preserve">Sinyal risiko muncul ketika nilai indikator sama dengan atau lebih rendah dari ambang batas. Status </w:t>
+        <w:t xml:space="preserve">Sinyal risiko diberikan ketika nilai indikator berada pada atau di bawah threshold. Status </w:t>
       </w:r>
       <w:r>
         <w:rPr>
@@ -2774,7 +2774,7 @@
           <w:color w:val="000000"/>
           <w:sz w:val="20"/>
         </w:rPr>
-        <w:t>. Perbandingan dengan model terpilih digunakan untuk mengukur perubahan cakupan deteksi, precision, dan kebutuhan verifikasi.</w:t>
+        <w:t>. Perbandingan dengan model terpilih digunakan untuk mengukur perubahan cakupan deteksi, precision, dan beban verifikasi.</w:t>
       </w:r>
     </w:p>
     <w:p>
@@ -2808,7 +2808,7 @@
           <w:color w:val="000000"/>
           <w:sz w:val="20"/>
         </w:rPr>
-        <w:t>Dashboard statis dibangun menggunakan Matplotlib dan Seaborn. Dashboard memuat KPI mahasiswa unik, jumlah dan persentase prioritas intervensi, distribusi level risiko, risiko per module-presentation, distribusi probabilitas, sinyal dominan, median aktivitas VLE dan assessment, confusion matrix, serta perbandingan model dengan lapisan risiko berbasis aturan.</w:t>
+        <w:t>Dashboard statis dibangun menggunakan Matplotlib dan Seaborn. Dashboard memuat KPI mahasiswa unik, jumlah dan persentase prioritas intervensi, distribusi level risiko, risiko per module-presentation, distribusi probabilitas, sinyal dominan, median aktivitas VLE dan assessment, confusion matrix, serta perbandingan model dengan knowledge layer.</w:t>
       </w:r>
     </w:p>
     <w:p>
@@ -2845,7 +2845,7 @@
           <w:color w:val="000000"/>
           <w:sz w:val="20"/>
         </w:rPr>
-        <w:t>, dan jumlah sinyal. Keluaran tersebut mendukung beberapa tingkat keputusan. Pimpinan akademik memperoleh gambaran skala risiko, program studi melihat konsentrasi risiko antar module-presentation, dan tutor atau dosen wali memperoleh alasan serta rekomendasi pada tingkat mahasiswa. Sistem diposisikan sebagai pendukung keputusan yang membantu pemangku kepentingan menetapkan tindak lanjut berdasarkan bukti analitik dan pertimbangan akademik.</w:t>
+        <w:t>, dan jumlah sinyal. Keluaran tersebut mendukung beberapa tingkat keputusan. Pimpinan akademik memperoleh gambaran skala risiko, program studi melihat konsentrasi risiko antar module-presentation, dan tutor atau dosen wali memperoleh alasan serta rekomendasi pada tingkat mahasiswa. Sistem diposisikan sebagai decision support yang membantu stakeholder menetapkan tindak lanjut berdasarkan bukti analitik dan pertimbangan akademik.</w:t>
       </w:r>
     </w:p>
     <w:p>
@@ -2896,7 +2896,7 @@
           <w:color w:val="000000"/>
           <w:sz w:val="20"/>
         </w:rPr>
-        <w:t xml:space="preserve">Dataset hasil olahan memuat 32.593 student-module-presentation dari 28.785 mahasiswa unik. Kelas </w:t>
+        <w:t xml:space="preserve">Dataset hasil preprocessing memuat 32.593 student-module-presentation dari 28.785 mahasiswa unik. Kelas </w:t>
       </w:r>
       <w:r>
         <w:rPr>
@@ -2936,7 +2936,7 @@
           <w:color w:val="000000"/>
           <w:sz w:val="20"/>
         </w:rPr>
-        <w:t xml:space="preserve"> berjumlah 15.385 baris. Data latih-validasi memuat 26.122 baris, sedangkan data uji hold-out memuat 6.471 baris dengan 3.398 kasus </w:t>
+        <w:t xml:space="preserve"> berjumlah 15.385 baris. Train-validation memuat 26.122 baris, sedangkan hold-out test memuat 6.471 baris dengan 3.398 kasus </w:t>
       </w:r>
       <w:r>
         <w:rPr>
@@ -2996,7 +2996,7 @@
           <w:color w:val="000000"/>
           <w:sz w:val="20"/>
         </w:rPr>
-        <w:t xml:space="preserve"> memastikan tidak ada mahasiswa yang muncul pada kedua bagian data.</w:t>
+        <w:t xml:space="preserve"> menghasilkan overlap mahasiswa sebesar nol.</w:t>
       </w:r>
     </w:p>
     <w:p>
@@ -3108,7 +3108,7 @@
           <w:color w:val="000000"/>
           <w:sz w:val="20"/>
         </w:rPr>
-        <w:t xml:space="preserve">Pemeriksaan kualitas data kemudian dilakukan sebelum model dilatih. Data hilang terutama muncul pada </w:t>
+        <w:t xml:space="preserve">Pemeriksaan kualitas data kemudian dilakukan sebelum model dilatih. Missing value terutama muncul pada </w:t>
       </w:r>
       <w:r>
         <w:rPr>
@@ -3148,7 +3148,7 @@
           <w:color w:val="000000"/>
           <w:sz w:val="20"/>
         </w:rPr>
-        <w:t>. Dua kondisi tersebut ditangani dalam alur pemodelan berdasarkan data latih-validasi agar proses imputasi tidak dipengaruhi oleh data uji hold-out.</w:t>
+        <w:t>. Dua kondisi tersebut ditangani di dalam pipeline berdasarkan data train-validation agar proses imputasi tidak membawa informasi dari hold-out test.</w:t>
       </w:r>
     </w:p>
     <w:p>
@@ -3161,7 +3161,7 @@
         <w:drawing>
           <wp:inline xmlns:a="http://schemas.openxmlformats.org/drawingml/2006/main" xmlns:pic="http://schemas.openxmlformats.org/drawingml/2006/picture">
             <wp:extent cx="2971800" cy="1649091"/>
-            <wp:docPr id="2" name="Picture 2" descr="Fig. 2. Data hilang pada fitur dataset pemodelan." title="Fig"/>
+            <wp:docPr id="2" name="Picture 2" descr="Fig. 2. Missing value pada fitur dataset pemodelan." title="Fig"/>
             <wp:cNvGraphicFramePr>
               <a:graphicFrameLocks noChangeAspect="1"/>
             </wp:cNvGraphicFramePr>
@@ -3206,7 +3206,7 @@
           <w:color w:val="000000"/>
           <w:sz w:val="16"/>
         </w:rPr>
-        <w:t>Fig. 2. Data hilang pada fitur dataset pemodelan.</w:t>
+        <w:t>Fig. 2. Missing value pada fitur dataset pemodelan.</w:t>
       </w:r>
     </w:p>
     <w:p>
@@ -3260,7 +3260,7 @@
           <w:color w:val="000000"/>
           <w:sz w:val="20"/>
         </w:rPr>
-        <w:t xml:space="preserve"> tertinggi sebesar 0,7126 dan F1-score 0,7536. XGBoost menghasilkan accuracy dan ROC-AUC tertinggi, masing-masing sebesar 0,7582 dan 0,8440. Berdasarkan kriteria pemilihan yang memprioritaskan recall, Random Forest dipilih sebagai model akhir.</w:t>
+        <w:t xml:space="preserve"> tertinggi sebesar 0,7126 dan F1-score 0,7536. XGBoost menghasilkan accuracy dan ROC-AUC tertinggi, masing-masing sebesar 0,7582 dan 0,8440. Berdasarkan kriteria pemilihan yang memprioritaskan recall, Random Forest dipilih sebagai model final.</w:t>
       </w:r>
     </w:p>
     <w:p>
@@ -3284,7 +3284,7 @@
           <w:color w:val="000000"/>
           <w:sz w:val="16"/>
         </w:rPr>
-        <w:t>HASIL 5-FOLD GROUPKFOLD PADA DATA LATIH-VALIDASI</w:t>
+        <w:t>HASIL 5-FOLD GROUPKFOLD PADA TRAIN-VALIDATION</w:t>
       </w:r>
     </w:p>
     <w:tbl>
@@ -4036,7 +4036,7 @@
           <w:color w:val="000000"/>
           <w:sz w:val="20"/>
         </w:rPr>
-        <w:t>C. Hold-Out Evaluation</w:t>
+        <w:t>C. Hold-Out Test Performance</w:t>
       </w:r>
     </w:p>
     <w:p>
@@ -4053,7 +4053,7 @@
           <w:color w:val="000000"/>
           <w:sz w:val="20"/>
         </w:rPr>
-        <w:t xml:space="preserve">Tabel II memperlihatkan performa pada data uji hold-out. Random Forest mencapai accuracy 0,7592, precision </w:t>
+        <w:t xml:space="preserve">Tabel II memperlihatkan performa pada hold-out test. Random Forest mencapai accuracy 0,7592, precision </w:t>
       </w:r>
       <w:r>
         <w:rPr>
@@ -4093,7 +4093,7 @@
           <w:color w:val="000000"/>
           <w:sz w:val="20"/>
         </w:rPr>
-        <w:t xml:space="preserve"> mencapai 0,7054. Logistic Regression menghasilkan recall terendah sebesar 0,6869.</w:t>
+        <w:t xml:space="preserve"> berada pada 0,7054. Logistic Regression menghasilkan recall terendah sebesar 0,6869.</w:t>
       </w:r>
     </w:p>
     <w:p>
@@ -4117,7 +4117,7 @@
           <w:color w:val="000000"/>
           <w:sz w:val="16"/>
         </w:rPr>
-        <w:t>PERFORMA MODEL PADA DATA UJI HOLD-OUT</w:t>
+        <w:t>PERFORMA MODEL PADA HOLD-OUT TEST</w:t>
       </w:r>
     </w:p>
     <w:tbl>
@@ -4869,7 +4869,7 @@
           <w:color w:val="000000"/>
           <w:sz w:val="20"/>
         </w:rPr>
-        <w:t xml:space="preserve">Ringkasan klasifikasi Random Forest menunjukkan precision 0,80, recall 0,72, dan F1-score 0,76 pada 3.398 kasus </w:t>
+        <w:t xml:space="preserve">Classification report Random Forest menunjukkan precision 0,80, recall 0,72, dan F1-score 0,76 pada 3.398 kasus </w:t>
       </w:r>
       <w:r>
         <w:rPr>
@@ -4909,7 +4909,7 @@
           <w:color w:val="000000"/>
           <w:sz w:val="20"/>
         </w:rPr>
-        <w:t xml:space="preserve">, precision mencapai 0,72, recall 0,81, dan F1-score 0,76. Rata-rata tertimbang F1-score mencapai 0,76. Perbandingan metrik antar model menempatkan Random Forest sebagai pilihan yang paling relevan untuk konteks peringatan dini karena recall </w:t>
+        <w:t xml:space="preserve">, precision mencapai 0,72, recall 0,81, dan F1-score 0,76. Weighted average F1-score mencapai 0,76. Perbandingan metrik antar model menempatkan Random Forest sebagai pilihan yang paling relevan untuk konteks early warning karena recall </w:t>
       </w:r>
       <w:r>
         <w:rPr>
@@ -4942,7 +4942,7 @@
         <w:drawing>
           <wp:inline xmlns:a="http://schemas.openxmlformats.org/drawingml/2006/main" xmlns:pic="http://schemas.openxmlformats.org/drawingml/2006/picture">
             <wp:extent cx="2971800" cy="2176023"/>
-            <wp:docPr id="3" name="Picture 3" descr="Fig. 3. Perbandingan metrik AtRisk pada data uji hold-out." title="Fig"/>
+            <wp:docPr id="3" name="Picture 3" descr="Fig. 3. Perbandingan metrik AtRisk pada hold-out test." title="Fig"/>
             <wp:cNvGraphicFramePr>
               <a:graphicFrameLocks noChangeAspect="1"/>
             </wp:cNvGraphicFramePr>
@@ -4987,7 +4987,7 @@
           <w:color w:val="000000"/>
           <w:sz w:val="16"/>
         </w:rPr>
-        <w:t>Fig. 3. Perbandingan metrik AtRisk pada data uji hold-out.</w:t>
+        <w:t>Fig. 3. Perbandingan metrik AtRisk pada hold-out test.</w:t>
       </w:r>
     </w:p>
     <w:p>
@@ -5037,7 +5037,7 @@
         <w:drawing>
           <wp:inline xmlns:a="http://schemas.openxmlformats.org/drawingml/2006/main" xmlns:pic="http://schemas.openxmlformats.org/drawingml/2006/picture">
             <wp:extent cx="2971800" cy="2176023"/>
-            <wp:docPr id="4" name="Picture 4" descr="Fig. 4. Confusion matrix Random Forest pada data uji hold-out." title="Fig"/>
+            <wp:docPr id="4" name="Picture 4" descr="Fig. 4. Confusion matrix Random Forest pada hold-out test." title="Fig"/>
             <wp:cNvGraphicFramePr>
               <a:graphicFrameLocks noChangeAspect="1"/>
             </wp:cNvGraphicFramePr>
@@ -5082,7 +5082,7 @@
           <w:color w:val="000000"/>
           <w:sz w:val="16"/>
         </w:rPr>
-        <w:t>Fig. 4. Confusion matrix Random Forest pada data uji hold-out.</w:t>
+        <w:t>Fig. 4. Confusion matrix Random Forest pada hold-out test.</w:t>
       </w:r>
     </w:p>
     <w:p>
@@ -5112,7 +5112,7 @@
         <w:drawing>
           <wp:inline xmlns:a="http://schemas.openxmlformats.org/drawingml/2006/main" xmlns:pic="http://schemas.openxmlformats.org/drawingml/2006/picture">
             <wp:extent cx="2971800" cy="2172736"/>
-            <wp:docPr id="5" name="Picture 5" descr="Fig. 5. Kurva ROC pada data uji hold-out." title="Fig"/>
+            <wp:docPr id="5" name="Picture 5" descr="Fig. 5. Kurva ROC pada hold-out test." title="Fig"/>
             <wp:cNvGraphicFramePr>
               <a:graphicFrameLocks noChangeAspect="1"/>
             </wp:cNvGraphicFramePr>
@@ -5157,7 +5157,7 @@
           <w:color w:val="000000"/>
           <w:sz w:val="16"/>
         </w:rPr>
-        <w:t>Fig. 5. Kurva ROC pada data uji hold-out.</w:t>
+        <w:t>Fig. 5. Kurva ROC pada hold-out test.</w:t>
       </w:r>
     </w:p>
     <w:p>
@@ -5174,7 +5174,7 @@
           <w:color w:val="000000"/>
           <w:sz w:val="20"/>
         </w:rPr>
-        <w:t>Kontribusi fitur Random Forest memperlihatkan bahwa sinyal perilaku awal menjadi pembeda utama. Total klik VLE, hari aktivitas terakhir, jumlah hari aktif, dan ragam situs yang diakses muncul sebagai prediktor teratas, diikuti fitur assessment dan registrasi. Temuan ini selaras dengan tujuan peringatan dini karena model banyak bertumpu pada jejak engagement yang sudah tersedia sampai akhir minggu keempat. Nilai importance tetap ditafsirkan sebagai kontribusi prediktif, bukan bukti hubungan sebab akibat.</w:t>
+        <w:t>Kontribusi fitur Random Forest memperlihatkan bahwa sinyal perilaku awal menjadi pembeda utama. Total klik VLE, hari aktivitas terakhir, jumlah hari aktif, dan ragam situs yang diakses muncul sebagai prediktor teratas, diikuti fitur assessment dan registrasi. Temuan ini selaras dengan tujuan early warning karena model banyak bertumpu pada jejak engagement yang sudah tersedia sampai akhir minggu keempat. Nilai importance tetap dibaca sebagai kontribusi prediktif, bukan bukti hubungan sebab akibat.</w:t>
       </w:r>
     </w:p>
     <w:p>
@@ -5249,7 +5249,7 @@
           <w:color w:val="000000"/>
           <w:sz w:val="20"/>
         </w:rPr>
-        <w:t>D. Rule-Based Risk Layer</w:t>
+        <w:t>D. Knowledge-Based Risk Layer</w:t>
       </w:r>
     </w:p>
     <w:p>
@@ -5266,7 +5266,7 @@
           <w:color w:val="000000"/>
           <w:sz w:val="20"/>
         </w:rPr>
-        <w:t xml:space="preserve">Ambang kuartil bawah data latih-validasi adalah skor assessment 0, jumlah assessment 0, total klik VLE 47, dan hari aktif VLE 4. Nilai nol pada indikator assessment menunjukkan bahwa sebagian mahasiswa belum mengumpulkan assessment sampai akhir minggu keempat. Lapisan risiko berbasis aturan menghasilkan 1.795 </w:t>
+        <w:t xml:space="preserve">Threshold kuartil bawah data train-validation adalah skor assessment 0, jumlah assessment 0, total klik VLE 47, dan hari aktif VLE 4. Nilai nol pada indikator assessment menunjukkan bahwa sebagian mahasiswa belum mengumpulkan assessment sampai akhir minggu keempat. Knowledge layer menghasilkan 1.795 </w:t>
       </w:r>
       <w:r>
         <w:rPr>
@@ -5326,7 +5326,7 @@
           <w:color w:val="000000"/>
           <w:sz w:val="20"/>
         </w:rPr>
-        <w:t xml:space="preserve"> pada data uji hold-out.</w:t>
+        <w:t xml:space="preserve"> pada hold-out test.</w:t>
       </w:r>
     </w:p>
     <w:p>
@@ -5343,7 +5343,7 @@
           <w:color w:val="000000"/>
           <w:sz w:val="20"/>
         </w:rPr>
-        <w:t>Tabel III membandingkan Random Forest dengan sistem gabungan. Lapisan risiko berbasis aturan meningkatkan recall dari 0,7172 menjadi 0,7849. Precision berubah dari 0,8032 menjadi 0,7039, sedangkan accuracy berubah dari 0,7592 menjadi 0,7136. Perubahan tersebut menunjukkan perluasan cakupan deteksi disertai peningkatan jumlah alarm yang memerlukan verifikasi oleh pemangku kepentingan akademik.</w:t>
+        <w:t>Tabel III membandingkan Random Forest dengan sistem gabungan. Knowledge layer meningkatkan recall dari 0,7172 menjadi 0,7849. Precision berubah dari 0,8032 menjadi 0,7039, sedangkan accuracy berubah dari 0,7592 menjadi 0,7136. Perubahan tersebut menunjukkan perluasan cakupan deteksi disertai peningkatan jumlah alarm yang memerlukan verifikasi stakeholder.</w:t>
       </w:r>
     </w:p>
     <w:p>
@@ -5367,7 +5367,7 @@
           <w:color w:val="000000"/>
           <w:sz w:val="16"/>
         </w:rPr>
-        <w:t>PERBANDINGAN MODEL DAN LAPISAN RISIKO BERBASIS ATURAN</w:t>
+        <w:t>PERBANDINGAN MODEL DAN KNOWLEDGE-BASED RISK LAYER</w:t>
       </w:r>
     </w:p>
     <w:tbl>
@@ -5473,7 +5473,7 @@
                 <w:color w:val="000000"/>
                 <w:sz w:val="13"/>
               </w:rPr>
-              <w:t>RF + Lapisan Aturan</w:t>
+              <w:t>RF + Knowledge Layer</w:t>
             </w:r>
           </w:p>
         </w:tc>
@@ -5911,7 +5911,7 @@
           <w:color w:val="000000"/>
           <w:sz w:val="20"/>
         </w:rPr>
-        <w:t xml:space="preserve">. Sinyal paling dominan adalah skor assessment rendah dengan 2.341 kasus. Module GGG presentation 2014J memiliki proporsi prioritas tertinggi pada data uji hold-out, yaitu 100% kasus </w:t>
+        <w:t xml:space="preserve">. Sinyal paling dominan adalah skor assessment rendah dengan 2.341 kasus. Module GGG presentation 2014J memiliki proporsi prioritas tertinggi pada hold-out test, yaitu 100% kasus </w:t>
       </w:r>
       <w:r>
         <w:rPr>
@@ -5951,7 +5951,7 @@
           <w:color w:val="000000"/>
           <w:sz w:val="20"/>
         </w:rPr>
-        <w:t>. Indikator tersebut berfungsi sebagai sinyal untuk meninjau konteks modul dan kapasitas intervensi.</w:t>
+        <w:t>. Indikator tersebut berfungsi sebagai sinyal untuk peninjauan konteks modul dan kapasitas intervensi.</w:t>
       </w:r>
     </w:p>
     <w:p>
@@ -6005,7 +6005,7 @@
           <w:color w:val="000000"/>
           <w:sz w:val="20"/>
         </w:rPr>
-        <w:t>Keluaran analitik kemudian disajikan ke dalam dashboard agar hasil model menjadi prioritas tindakan, bukan hanya angka evaluasi. Tampilan tersebut menghubungkan KPI risiko, level prioritas, konsentrasi module-presentation, distribusi probabilitas, sinyal dominan, perbandingan perilaku, confusion matrix, dan perubahan performa setelah lapisan risiko berbasis aturan. Dengan susunan ini, pengguna dapat bergerak dari ringkasan strategis menuju penelusuran kelompok atau mahasiswa yang membutuhkan tindak lanjut.</w:t>
+        <w:t>Keluaran analitik kemudian diterjemahkan ke dalam dashboard agar hasil model dapat dibaca sebagai prioritas tindakan, bukan hanya sebagai angka evaluasi. Tampilan tersebut menghubungkan KPI risiko, level prioritas, konsentrasi module-presentation, distribusi probabilitas, sinyal dominan, perbandingan perilaku, confusion matrix, dan trade-off setelah knowledge layer. Dengan susunan ini, pengguna dapat bergerak dari ringkasan strategis menuju penelusuran kelompok atau mahasiswa yang membutuhkan tindak lanjut.</w:t>
       </w:r>
     </w:p>
     <w:p>
@@ -6029,7 +6029,7 @@
         <w:drawing>
           <wp:inline xmlns:a="http://schemas.openxmlformats.org/drawingml/2006/main" xmlns:pic="http://schemas.openxmlformats.org/drawingml/2006/picture">
             <wp:extent cx="5486400" cy="4940761"/>
-            <wp:docPr id="7" name="Picture 7" descr="Fig. 7. Dashboard peringatan dini OULAD pada akhir minggu keempat." title="Fig"/>
+            <wp:docPr id="7" name="Picture 7" descr="Fig. 7. Dashboard early warning OULAD pada akhir minggu keempat." title="Fig"/>
             <wp:cNvGraphicFramePr>
               <a:graphicFrameLocks noChangeAspect="1"/>
             </wp:cNvGraphicFramePr>
@@ -6074,7 +6074,7 @@
           <w:color w:val="000000"/>
           <w:sz w:val="16"/>
         </w:rPr>
-        <w:t>Fig. 7. Dashboard peringatan dini OULAD pada akhir minggu keempat.</w:t>
+        <w:t>Fig. 7. Dashboard early warning OULAD pada akhir minggu keempat.</w:t>
       </w:r>
     </w:p>
     <w:p>
@@ -6139,7 +6139,7 @@
           <w:color w:val="000000"/>
           <w:sz w:val="20"/>
         </w:rPr>
-        <w:t xml:space="preserve"> tertinggi pada cross-validation dan data uji hold-out. Penelitian ini memprioritaskan recall karena sistem peringatan dini diarahkan untuk memperluas cakupan mahasiswa berisiko yang dapat diverifikasi oleh pemangku kepentingan akademik. F1-score Random Forest dan XGBoost pada data uji hold-out memiliki nilai sama sebesar 0,7578, sehingga recall menjadi pembeda yang relevan.</w:t>
+        <w:t xml:space="preserve"> tertinggi pada cross-validation dan hold-out test. Penelitian ini memprioritaskan recall karena early warning diarahkan untuk memperluas cakupan mahasiswa berisiko yang dapat diverifikasi oleh stakeholder. F1-score Random Forest dan XGBoost pada hold-out test memiliki nilai sama sebesar 0,7578, sehingga recall menjadi pembeda yang relevan.</w:t>
       </w:r>
     </w:p>
     <w:p>
@@ -6156,7 +6156,7 @@
           <w:color w:val="000000"/>
           <w:sz w:val="20"/>
         </w:rPr>
-        <w:t>Performa sekitar 0,76 lebih rendah dibandingkan eksperimen yang memakai aktivitas seluruh semester dan status unregistration. Nilai tersebut merepresentasikan kondisi yang lebih menantang karena model hanya menerima informasi sampai hari ke-28. Pembatasan temporal menjaga hubungan antara waktu fitur tersedia dan waktu keputusan intervensi. Hasil ini memperlihatkan bahwa evaluasi sistem peringatan dini perlu ditafsirkan berdasarkan horizon prediksi, sehingga perbandingan performa antarpenelitian memerlukan kesetaraan batas data.</w:t>
+        <w:t>Performa sekitar 0,76 lebih rendah dibandingkan eksperimen yang memakai aktivitas seluruh semester dan status unregistration. Nilai tersebut merepresentasikan kondisi yang lebih menantang karena model hanya menerima informasi sampai hari ke-28. Pembatasan temporal menjaga hubungan antara waktu fitur tersedia dan waktu keputusan intervensi. Hasil ini memperlihatkan bahwa evaluasi early warning perlu dibaca berdasarkan horizon prediksi, sehingga perbandingan performa antarpenelitian memerlukan kesetaraan cut-off data.</w:t>
       </w:r>
     </w:p>
     <w:p>
@@ -6173,7 +6173,7 @@
           <w:color w:val="000000"/>
           <w:sz w:val="20"/>
         </w:rPr>
-        <w:t>Ambang assessment sebesar nol memiliki makna operasional khusus. Pada minggu keempat, sejumlah module-presentation belum menghasilkan submission assessment untuk semua mahasiswa. Kondisi belum mengumpulkan assessment menjadi sinyal engagement awal, sedangkan kemampuan membedakan skor rendah di atas nol masih terbatas. Penelitian lanjutan dapat menggunakan ambang per module-presentation atau menyesuaikan batas waktu dengan jadwal assessment untuk memperoleh aturan yang lebih kontekstual.</w:t>
+        <w:t>Threshold assessment sebesar nol memiliki makna operasional khusus. Pada minggu keempat, sejumlah module-presentation belum menghasilkan submission assessment untuk semua mahasiswa. Kondisi belum mengumpulkan assessment menjadi sinyal engagement awal, sedangkan kemampuan membedakan skor rendah di atas nol masih terbatas. Penelitian lanjutan dapat menggunakan threshold per module-presentation atau menyesuaikan cut-off dengan jadwal assessment untuk memperoleh aturan yang lebih kontekstual.</w:t>
       </w:r>
     </w:p>
     <w:p>
@@ -6190,7 +6190,7 @@
           <w:color w:val="000000"/>
           <w:sz w:val="20"/>
         </w:rPr>
-        <w:t xml:space="preserve">Lapisan risiko berbasis aturan meningkatkan recall sebesar 0,0677 poin dari 0,7172 menjadi 0,7849. Peningkatan tersebut memperluas cakupan mahasiswa </w:t>
+        <w:t xml:space="preserve">Knowledge-based risk layer meningkatkan recall sebesar 0,0677 poin dari 0,7172 menjadi 0,7849. Peningkatan tersebut memperluas cakupan mahasiswa </w:t>
       </w:r>
       <w:r>
         <w:rPr>
@@ -6210,7 +6210,7 @@
           <w:color w:val="000000"/>
           <w:sz w:val="20"/>
         </w:rPr>
-        <w:t xml:space="preserve"> yang masuk antrean intervensi. Penurunan precision menjadi 0,7039 menunjukkan bertambahnya kasus yang perlu diverifikasi. Perubahan ini berkaitan langsung dengan kapasitas operasional. Institusi dengan sumber daya konseling terbatas dapat memprioritaskan </w:t>
+        <w:t xml:space="preserve"> yang masuk antrean intervensi. Penurunan precision menjadi 0,7039 menunjukkan bertambahnya kasus yang perlu diverifikasi. Trade-off ini berkaitan langsung dengan kapasitas operasional. Institusi dengan sumber daya konseling terbatas dapat memprioritaskan </w:t>
       </w:r>
       <w:r>
         <w:rPr>
@@ -6267,7 +6267,7 @@
           <w:color w:val="000000"/>
           <w:sz w:val="20"/>
         </w:rPr>
-        <w:t>Lapisan berbasis aturan juga meningkatkan interpretabilitas praktis. Probabilitas model dilengkapi dengan alasan seperti aktivitas VLE rendah, hari aktif rendah, atau assessment yang belum dikerjakan. Informasi tersebut membantu memilih bentuk intervensi yang sesuai. Hubungan ini bersifat asosiasi prediktif, sehingga rekomendasi tetap memerlukan validasi manusia dan informasi kontekstual dari dosen atau tutor.</w:t>
+        <w:t>Knowledge layer juga meningkatkan interpretabilitas praktis. Probabilitas model dilengkapi dengan alasan seperti aktivitas VLE rendah, hari aktif rendah, atau assessment yang belum dikerjakan. Informasi tersebut membantu memilih bentuk intervensi yang sesuai. Hubungan ini bersifat asosiasi prediktif, sehingga rekomendasi tetap memerlukan validasi manusia dan informasi kontekstual dari dosen atau tutor.</w:t>
       </w:r>
     </w:p>
     <w:p>
@@ -6284,7 +6284,7 @@
           <w:color w:val="000000"/>
           <w:sz w:val="20"/>
         </w:rPr>
-        <w:t>Dashboard memperluas fungsi eksperimen dari evaluasi teknis menjadi Business Intelligence. Agregasi per module-presentation membantu program studi mengenali konsentrasi risiko, sedangkan daftar prioritas mendukung tindak lanjut tingkat mahasiswa. Temuan 100% prioritas pada GGG 2014J perlu ditafsirkan bersama ukuran kelompok, jadwal assessment, dan karakteristik modul. Dashboard menyediakan titik awal investigasi dan monitoring, sedangkan keputusan akademik ditetapkan melalui proses institusional.</w:t>
+        <w:t>Dashboard memperluas fungsi eksperimen dari evaluasi teknis menjadi Business Intelligence. Agregasi per module-presentation membantu program studi mengenali konsentrasi risiko, sedangkan daftar prioritas mendukung tindak lanjut tingkat mahasiswa. Temuan 100% prioritas pada GGG 2014J perlu dibaca bersama ukuran kelompok, jadwal assessment, dan karakteristik modul. Dashboard menyediakan titik awal investigasi dan monitoring, sedangkan keputusan akademik ditetapkan melalui proses institusional.</w:t>
       </w:r>
     </w:p>
     <w:p>
@@ -6301,7 +6301,7 @@
           <w:color w:val="000000"/>
           <w:sz w:val="20"/>
         </w:rPr>
-        <w:t>Penelitian memiliki beberapa keterbatasan. OULAD berasal dari konteks Open University di Inggris sehingga validitas eksternal pada institusi lain memerlukan pengujian ulang. Fitur perilaku dibatasi pada agregasi sampai hari ke-28 dan belum memodelkan urutan temporal harian. Hyperparameter model menggunakan konfigurasi awal. Ambang berbasis kuartil memerlukan validasi pakar dan dapat berubah mengikuti cohort, module-presentation, atau kebijakan akademik. Evaluasi juga mengukur performa deteksi, sedangkan dampak intervensi terhadap retensi memerlukan desain eksperimen lanjutan.</w:t>
+        <w:t>Penelitian memiliki beberapa keterbatasan. OULAD berasal dari konteks Open University di Inggris sehingga validitas eksternal pada institusi lain memerlukan pengujian ulang. Fitur perilaku dibatasi pada agregasi sampai hari ke-28 dan belum memodelkan urutan temporal harian. Hyperparameter model menggunakan konfigurasi baseline. Threshold berbasis kuartil memerlukan validasi pakar dan dapat berubah mengikuti cohort, module-presentation, atau kebijakan akademik. Evaluasi juga mengukur performa deteksi, sedangkan dampak intervensi terhadap retensi memerlukan desain eksperimen lanjutan.</w:t>
       </w:r>
     </w:p>
     <w:p>
@@ -6335,7 +6335,7 @@
           <w:color w:val="000000"/>
           <w:sz w:val="20"/>
         </w:rPr>
-        <w:t xml:space="preserve">Penelitian ini mengembangkan sistem peringatan dini risiko dropout mahasiswa pada akhir minggu keempat menggunakan OULAD. Dataset dibentuk pada unit student-module-presentation dengan fitur demografis, registrasi awal, assessment, dan aktivitas VLE sampai hari ke-28. Pemisahan berbasis </w:t>
+        <w:t xml:space="preserve">Penelitian ini mengembangkan early warning risiko dropout mahasiswa pada akhir minggu keempat menggunakan OULAD. Dataset dibentuk pada unit student-module-presentation dengan fitur demografis, registrasi awal, assessment, dan aktivitas VLE sampai hari ke-28. Pemisahan berbasis </w:t>
       </w:r>
       <w:r>
         <w:rPr>
@@ -6355,7 +6355,7 @@
           <w:color w:val="000000"/>
           <w:sz w:val="20"/>
         </w:rPr>
-        <w:t xml:space="preserve"> menjaga independensi mahasiswa antara data latih-validasi dan data uji hold-out.</w:t>
+        <w:t xml:space="preserve"> menjaga independensi mahasiswa antara train-validation dan hold-out test.</w:t>
       </w:r>
     </w:p>
     <w:p>
@@ -6392,7 +6392,7 @@
           <w:color w:val="000000"/>
           <w:sz w:val="20"/>
         </w:rPr>
-        <w:t xml:space="preserve"> cross-validation tertinggi sebesar 0,7126. Pada data uji hold-out, model menghasilkan accuracy 0,7592, precision 0,8032, recall 0,7172, F1-score 0,7578, dan ROC-AUC 0,8396. Lapisan risiko berbasis aturan meningkatkan recall menjadi 0,7849 dengan menggabungkan prediksi model dan empat sinyal perilaku awal. Sistem menghasilkan level risiko, alasan, dan rekomendasi yang dapat disusun menjadi antrean intervensi.</w:t>
+        <w:t xml:space="preserve"> cross-validation tertinggi sebesar 0,7126. Pada hold-out test, model menghasilkan accuracy 0,7592, precision 0,8032, recall 0,7172, F1-score 0,7578, dan ROC-AUC 0,8396. Knowledge-based risk layer meningkatkan recall menjadi 0,7849 dengan menggabungkan prediksi model dan empat sinyal perilaku awal. Sistem menghasilkan level risiko, alasan, dan rekomendasi yang dapat diterjemahkan menjadi antrean intervensi.</w:t>
       </w:r>
     </w:p>
     <w:p>
@@ -6409,7 +6409,7 @@
           <w:color w:val="000000"/>
           <w:sz w:val="20"/>
         </w:rPr>
-        <w:t>Dashboard Business Intelligence menyajikan distribusi risiko, prioritas module-presentation, sinyal dominan, performa model, dan daftar mahasiswa anonim untuk monitoring. Integrasi supervised learning, lapisan risiko berbasis aturan, dan visual analytics menghasilkan dasar pendukung keputusan yang menghubungkan prediksi dengan proses tindak lanjut akademik.</w:t>
+        <w:t>Dashboard Business Intelligence menyajikan distribusi risiko, prioritas module-presentation, sinyal dominan, performa model, dan daftar mahasiswa anonim untuk monitoring. Integrasi supervised learning, knowledge-based risk layer, dan visual analytics menghasilkan decision support yang menghubungkan prediksi dengan proses tindak lanjut akademik.</w:t>
       </w:r>
     </w:p>
     <w:p>
@@ -6426,7 +6426,7 @@
           <w:color w:val="000000"/>
           <w:sz w:val="20"/>
         </w:rPr>
-        <w:t>Pengembangan berikutnya dapat membandingkan horizon minggu keempat, kedelapan, dan kedua belas; menggunakan ambang per module-presentation; melakukan tuning hyperparameter; serta menguji validitas eksternal pada data institusi lain. Evaluasi dampak intervensi juga diperlukan untuk mengukur kontribusi sistem terhadap keberlanjutan studi mahasiswa.</w:t>
+        <w:t>Pengembangan berikutnya dapat membandingkan horizon minggu keempat, kedelapan, dan kedua belas; menggunakan threshold per module-presentation; melakukan tuning hyperparameter; serta menguji validitas eksternal pada data institusi lain. Evaluasi dampak intervensi juga diperlukan untuk mengukur kontribusi sistem terhadap keberlanjutan studi mahasiswa.</w:t>
       </w:r>
     </w:p>
     <w:p>

</xml_diff>